<commit_message>
refactor: simplify project for second-year assignment
</commit_message>
<xml_diff>
--- a/docs/report/Builder_Pattern_Car_Report.docx
+++ b/docs/report/Builder_Pattern_Car_Report.docx
@@ -2,202 +2,133 @@
 <file path=word/document.xml><?xml version="1.0" encoding="utf-8"?>
 <w:document xmlns:wpc="http://schemas.microsoft.com/office/word/2010/wordprocessingCanvas" xmlns:mo="http://schemas.microsoft.com/office/mac/office/2008/main" xmlns:mc="http://schemas.openxmlformats.org/markup-compatibility/2006" xmlns:mv="urn:schemas-microsoft-com:mac:vml" xmlns:o="urn:schemas-microsoft-com:office:office" xmlns:r="http://schemas.openxmlformats.org/officeDocument/2006/relationships" xmlns:m="http://schemas.openxmlformats.org/officeDocument/2006/math" xmlns:v="urn:schemas-microsoft-com:vml" xmlns:wp14="http://schemas.microsoft.com/office/word/2010/wordprocessingDrawing" xmlns:wp="http://schemas.openxmlformats.org/drawingml/2006/wordprocessingDrawing" xmlns:w10="urn:schemas-microsoft-com:office:word" xmlns:w="http://schemas.openxmlformats.org/wordprocessingml/2006/main" xmlns:w14="http://schemas.microsoft.com/office/word/2010/wordml" xmlns:wpg="http://schemas.microsoft.com/office/word/2010/wordprocessingGroup" xmlns:wpi="http://schemas.microsoft.com/office/word/2010/wordprocessingInk" xmlns:wne="http://schemas.microsoft.com/office/word/2006/wordml" xmlns:wps="http://schemas.microsoft.com/office/word/2010/wordprocessingShape" mc:Ignorable="w14 wp14">
   <w:body>
-    <w:p/>
-    <w:p/>
-    <w:p/>
+    <w:p>
+      <w:pPr>
+        <w:jc w:val="center"/>
+      </w:pPr>
+      <w:r>
+        <w:rPr>
+          <w:rFonts w:ascii="Times New Roman" w:hAnsi="Times New Roman"/>
+          <w:b/>
+          <w:i w:val="0"/>
+          <w:color w:val="000000"/>
+          <w:sz w:val="28"/>
+        </w:rPr>
+        <w:t>ASTANA IT UNIVERSITY</w:t>
+      </w:r>
+    </w:p>
+    <w:p>
+      <w:pPr>
+        <w:jc w:val="center"/>
+      </w:pPr>
+      <w:r>
+        <w:rPr>
+          <w:rFonts w:ascii="Times New Roman" w:hAnsi="Times New Roman"/>
+          <w:b w:val="0"/>
+          <w:i w:val="0"/>
+          <w:color w:val="000000"/>
+          <w:sz w:val="24"/>
+        </w:rPr>
+        <w:t>School of Computer Engineering</w:t>
+      </w:r>
+    </w:p>
+    <w:p>
+      <w:pPr>
+        <w:spacing w:after="1800"/>
+        <w:jc w:val="center"/>
+      </w:pPr>
+      <w:r>
+        <w:rPr>
+          <w:rFonts w:ascii="Times New Roman" w:hAnsi="Times New Roman"/>
+          <w:b w:val="0"/>
+          <w:i w:val="0"/>
+          <w:color w:val="000000"/>
+          <w:sz w:val="24"/>
+        </w:rPr>
+        <w:t>ShP-2216 Software Design Patterns</w:t>
+      </w:r>
+    </w:p>
     <w:p>
       <w:pPr>
         <w:pStyle w:val="Title"/>
         <w:jc w:val="center"/>
       </w:pPr>
       <w:r>
-        <w:t>Builder Pattern Implementation for a Car</w:t>
+        <w:rPr>
+          <w:rFonts w:ascii="Times New Roman" w:hAnsi="Times New Roman"/>
+          <w:b/>
+          <w:i w:val="0"/>
+          <w:color w:val="000000"/>
+          <w:sz w:val="40"/>
+        </w:rPr>
+        <w:t>Assignment 1</w:t>
       </w:r>
     </w:p>
     <w:p>
       <w:pPr>
-        <w:spacing w:before="160" w:after="600"/>
+        <w:spacing w:after="1800"/>
         <w:jc w:val="center"/>
       </w:pPr>
       <w:r>
         <w:rPr>
-          <w:rFonts w:ascii="Arial" w:hAnsi="Arial"/>
+          <w:rFonts w:ascii="Times New Roman" w:hAnsi="Times New Roman"/>
           <w:b/>
+          <w:i w:val="0"/>
           <w:color w:val="000000"/>
-          <w:sz w:val="32"/>
+          <w:sz w:val="36"/>
         </w:rPr>
-        <w:t>Assignment 1 Report</w:t>
+        <w:t>Builder Pattern for a Car</w:t>
       </w:r>
     </w:p>
     <w:p>
       <w:pPr>
-        <w:spacing w:after="140"/>
+        <w:jc w:val="right"/>
+      </w:pPr>
+      <w:r>
+        <w:rPr>
+          <w:rFonts w:ascii="Times New Roman" w:hAnsi="Times New Roman"/>
+          <w:b w:val="0"/>
+          <w:i w:val="0"/>
+          <w:color w:val="000000"/>
+          <w:sz w:val="24"/>
+        </w:rPr>
+        <w:t>Student: Ziyadinkhan Kudaibergenuly</w:t>
+      </w:r>
+    </w:p>
+    <w:p>
+      <w:pPr>
+        <w:jc w:val="right"/>
+      </w:pPr>
+      <w:r>
+        <w:rPr>
+          <w:rFonts w:ascii="Times New Roman" w:hAnsi="Times New Roman"/>
+          <w:b w:val="0"/>
+          <w:i w:val="0"/>
+          <w:color w:val="000000"/>
+          <w:sz w:val="24"/>
+        </w:rPr>
+        <w:t>Group: SE 2501</w:t>
+      </w:r>
+    </w:p>
+    <w:p/>
+    <w:p/>
+    <w:p/>
+    <w:p/>
+    <w:p/>
+    <w:p/>
+    <w:p>
+      <w:pPr>
         <w:jc w:val="center"/>
       </w:pPr>
       <w:r>
         <w:rPr>
-          <w:rFonts w:ascii="Arial" w:hAnsi="Arial"/>
-          <w:b/>
+          <w:rFonts w:ascii="Times New Roman" w:hAnsi="Times New Roman"/>
+          <w:b w:val="0"/>
+          <w:i w:val="0"/>
           <w:color w:val="000000"/>
-          <w:sz w:val="22"/>
+          <w:sz w:val="24"/>
         </w:rPr>
-        <w:t xml:space="preserve">Course  </w:t>
-      </w:r>
-      <w:r>
-        <w:rPr>
-          <w:rFonts w:ascii="Arial" w:hAnsi="Arial"/>
-          <w:color w:val="000000"/>
-          <w:sz w:val="22"/>
-        </w:rPr>
-        <w:t>ShP-2216 Software Design Patterns</w:t>
-      </w:r>
-    </w:p>
-    <w:p>
-      <w:pPr>
-        <w:spacing w:after="140"/>
-        <w:jc w:val="center"/>
-      </w:pPr>
-      <w:r>
-        <w:rPr>
-          <w:rFonts w:ascii="Arial" w:hAnsi="Arial"/>
-          <w:b/>
-          <w:color w:val="000000"/>
-          <w:sz w:val="22"/>
-        </w:rPr>
-        <w:t xml:space="preserve">Institution  </w:t>
-      </w:r>
-      <w:r>
-        <w:rPr>
-          <w:rFonts w:ascii="Arial" w:hAnsi="Arial"/>
-          <w:color w:val="000000"/>
-          <w:sz w:val="22"/>
-        </w:rPr>
-        <w:t>Astana IT University School of Computer Engineering</w:t>
-      </w:r>
-    </w:p>
-    <w:p>
-      <w:pPr>
-        <w:spacing w:after="140"/>
-        <w:jc w:val="center"/>
-      </w:pPr>
-      <w:r>
-        <w:rPr>
-          <w:rFonts w:ascii="Arial" w:hAnsi="Arial"/>
-          <w:b/>
-          <w:color w:val="000000"/>
-          <w:sz w:val="22"/>
-        </w:rPr>
-        <w:t xml:space="preserve">Student  </w:t>
-      </w:r>
-      <w:r>
-        <w:rPr>
-          <w:rFonts w:ascii="Arial" w:hAnsi="Arial"/>
-          <w:color w:val="000000"/>
-          <w:sz w:val="22"/>
-        </w:rPr>
-        <w:t>[Enter your full name]</w:t>
-      </w:r>
-    </w:p>
-    <w:p>
-      <w:pPr>
-        <w:spacing w:after="140"/>
-        <w:jc w:val="center"/>
-      </w:pPr>
-      <w:r>
-        <w:rPr>
-          <w:rFonts w:ascii="Arial" w:hAnsi="Arial"/>
-          <w:b/>
-          <w:color w:val="000000"/>
-          <w:sz w:val="22"/>
-        </w:rPr>
-        <w:t xml:space="preserve">Group  </w:t>
-      </w:r>
-      <w:r>
-        <w:rPr>
-          <w:rFonts w:ascii="Arial" w:hAnsi="Arial"/>
-          <w:color w:val="000000"/>
-          <w:sz w:val="22"/>
-        </w:rPr>
-        <w:t>[Enter your group]</w:t>
-      </w:r>
-    </w:p>
-    <w:p>
-      <w:pPr>
-        <w:spacing w:after="140"/>
-        <w:jc w:val="center"/>
-      </w:pPr>
-      <w:r>
-        <w:rPr>
-          <w:rFonts w:ascii="Arial" w:hAnsi="Arial"/>
-          <w:b/>
-          <w:color w:val="000000"/>
-          <w:sz w:val="22"/>
-        </w:rPr>
-        <w:t xml:space="preserve">Language  </w:t>
-      </w:r>
-      <w:r>
-        <w:rPr>
-          <w:rFonts w:ascii="Arial" w:hAnsi="Arial"/>
-          <w:color w:val="000000"/>
-          <w:sz w:val="22"/>
-        </w:rPr>
-        <w:t>Java 17</w:t>
-      </w:r>
-    </w:p>
-    <w:p>
-      <w:pPr>
-        <w:spacing w:after="140"/>
-        <w:jc w:val="center"/>
-      </w:pPr>
-      <w:r>
-        <w:rPr>
-          <w:rFonts w:ascii="Arial" w:hAnsi="Arial"/>
-          <w:b/>
-          <w:color w:val="000000"/>
-          <w:sz w:val="22"/>
-        </w:rPr>
-        <w:t xml:space="preserve">Repository  </w:t>
-      </w:r>
-      <w:r>
-        <w:rPr>
-          <w:rFonts w:ascii="Arial" w:hAnsi="Arial"/>
-          <w:color w:val="000000"/>
-          <w:sz w:val="22"/>
-        </w:rPr>
-        <w:t>https://github.com/Ziyadin23/car-builder-pattern</w:t>
-      </w:r>
-    </w:p>
-    <w:p>
-      <w:pPr>
-        <w:spacing w:after="140"/>
-        <w:jc w:val="center"/>
-      </w:pPr>
-      <w:r>
-        <w:rPr>
-          <w:rFonts w:ascii="Arial" w:hAnsi="Arial"/>
-          <w:b/>
-          <w:color w:val="000000"/>
-          <w:sz w:val="22"/>
-        </w:rPr>
-        <w:t xml:space="preserve">Submission date  </w:t>
-      </w:r>
-      <w:r>
-        <w:rPr>
-          <w:rFonts w:ascii="Arial" w:hAnsi="Arial"/>
-          <w:color w:val="000000"/>
-          <w:sz w:val="22"/>
-        </w:rPr>
-        <w:t>[Confirm the date in Moodle]</w:t>
-      </w:r>
-    </w:p>
-    <w:p>
-      <w:pPr>
-        <w:spacing w:before="560"/>
-        <w:ind w:left="1008" w:right="1008"/>
-        <w:jc w:val="center"/>
-      </w:pPr>
-      <w:r>
-        <w:t>This report explains a complete Builder pattern implementation that creates passenger and sports cars through the same fluent construction interface.</w:t>
+        <w:t>Astana 2026</w:t>
       </w:r>
     </w:p>
     <w:p>
@@ -209,793 +140,159 @@
       <w:pPr>
         <w:pStyle w:val="Heading1"/>
         <w:keepNext/>
+        <w:spacing w:before="240" w:after="100"/>
       </w:pPr>
       <w:r>
         <w:t>1 Introduction</w:t>
       </w:r>
     </w:p>
     <w:p>
+      <w:pPr>
+        <w:spacing w:line="276" w:lineRule="auto" w:after="120"/>
+        <w:ind w:firstLine="576"/>
+        <w:jc w:val="both"/>
+      </w:pPr>
       <w:r>
-        <w:t>I chose Car as the product because a car contains required and optional parts that are easier to understand when configured step by step. The model, engine, seats, transmission, color, and optional features form one finished object, but different use cases require different combinations. A single constructor containing every value would be long, difficult to read, and unable to express the rules of passenger and sports cars clearly.</w:t>
+        <w:rPr>
+          <w:rFonts w:ascii="Times New Roman" w:hAnsi="Times New Roman"/>
+          <w:b w:val="0"/>
+          <w:i w:val="0"/>
+          <w:color w:val="000000"/>
+          <w:sz w:val="24"/>
+        </w:rPr>
+        <w:t>The topic of this assignment is the Builder creational design pattern. I chose Car as the product. A car is suitable for this pattern because it has several parts, such as a model, engine, number of seats, transmission, color, and additional features. These values can be added step by step instead of passing all of them to one long constructor.</w:t>
       </w:r>
     </w:p>
     <w:p>
+      <w:pPr>
+        <w:spacing w:line="276" w:lineRule="auto" w:after="120"/>
+        <w:ind w:firstLine="576"/>
+        <w:jc w:val="both"/>
+      </w:pPr>
       <w:r>
-        <w:t>The implementation uses CarBuilder as the construction interface, AbstractCarBuilder for shared behavior, PassengerCarBuilder and SportsCarBuilder as the two concrete builders, CarDirector for reusable recipes, and Main as the client. Calling build() validates the configuration and returns an immutable Car. The project compiles on JDK 17 without external libraries and includes seven executable tests.</w:t>
+        <w:rPr>
+          <w:rFonts w:ascii="Times New Roman" w:hAnsi="Times New Roman"/>
+          <w:b w:val="0"/>
+          <w:i w:val="0"/>
+          <w:color w:val="000000"/>
+          <w:sz w:val="24"/>
+        </w:rPr>
+        <w:t>The project creates two types of cars: a passenger car and a sports car. Both builders use the same construction methods, but they have different validation rules. The passenger car must have from four to seven seats. The sports car can have no more than two seats and must have at least 300 horsepower.</w:t>
       </w:r>
     </w:p>
     <w:p>
       <w:pPr>
         <w:pStyle w:val="Heading1"/>
         <w:keepNext/>
+        <w:spacing w:before="240" w:after="100"/>
       </w:pPr>
       <w:r>
-        <w:t>2 Builder Pattern Structure</w:t>
-      </w:r>
-    </w:p>
-    <w:p>
-      <w:r>
-        <w:t>Builder is a creational design pattern. It separates the process of constructing an object from the finished object itself. The same sequence of named steps can produce different representations while the client avoids a large constructor and does not manage validation details directly.</w:t>
-      </w:r>
-    </w:p>
-    <w:tbl>
-      <w:tblPr>
-        <w:tblW w:type="auto" w:w="0"/>
-        <w:jc w:val="center"/>
-        <w:tblLayout w:type="fixed"/>
-        <w:tblLook w:firstColumn="1" w:firstRow="1" w:lastColumn="0" w:lastRow="0" w:noHBand="0" w:noVBand="1" w:val="04A0"/>
-        <w:tblBorders>
-          <w:top w:val="single" w:sz="8" w:space="0" w:color="D9D9D9"/>
-          <w:left w:val="single" w:sz="8" w:space="0" w:color="D9D9D9"/>
-          <w:bottom w:val="single" w:sz="8" w:space="0" w:color="D9D9D9"/>
-          <w:right w:val="single" w:sz="8" w:space="0" w:color="D9D9D9"/>
-          <w:insideH w:val="single" w:sz="8" w:space="0" w:color="D9D9D9"/>
-          <w:insideV w:val="single" w:sz="8" w:space="0" w:color="D9D9D9"/>
-        </w:tblBorders>
-      </w:tblPr>
-      <w:tblGrid>
-        <w:gridCol w:w="3331"/>
-        <w:gridCol w:w="3331"/>
-        <w:gridCol w:w="3331"/>
-      </w:tblGrid>
-      <w:tr>
-        <w:trPr>
-          <w:tblHeader w:val="true"/>
-        </w:trPr>
-        <w:tc>
-          <w:tcPr>
-            <w:tcW w:type="dxa" w:w="1843"/>
-            <w:vAlign w:val="center"/>
-            <w:tcMar>
-              <w:top w:w="120" w:type="dxa"/>
-              <w:start w:w="130" w:type="dxa"/>
-              <w:bottom w:w="120" w:type="dxa"/>
-              <w:end w:w="130" w:type="dxa"/>
-            </w:tcMar>
-            <w:shd w:fill="1F4E78"/>
-          </w:tcPr>
-          <w:p>
-            <w:pPr>
-              <w:spacing w:after="0" w:line="252" w:lineRule="auto"/>
-            </w:pPr>
-            <w:r>
-              <w:rPr>
-                <w:rFonts w:ascii="Arial" w:hAnsi="Arial"/>
-                <w:b/>
-                <w:color w:val="FFFFFF"/>
-                <w:sz w:val="19"/>
-              </w:rPr>
-              <w:t>Pattern role</w:t>
-            </w:r>
-          </w:p>
-        </w:tc>
-        <w:tc>
-          <w:tcPr>
-            <w:tcW w:type="dxa" w:w="2232"/>
-            <w:vAlign w:val="center"/>
-            <w:tcMar>
-              <w:top w:w="120" w:type="dxa"/>
-              <w:start w:w="130" w:type="dxa"/>
-              <w:bottom w:w="120" w:type="dxa"/>
-              <w:end w:w="130" w:type="dxa"/>
-            </w:tcMar>
-            <w:shd w:fill="1F4E78"/>
-          </w:tcPr>
-          <w:p>
-            <w:pPr>
-              <w:spacing w:after="0" w:line="252" w:lineRule="auto"/>
-            </w:pPr>
-            <w:r>
-              <w:rPr>
-                <w:rFonts w:ascii="Arial" w:hAnsi="Arial"/>
-                <w:b/>
-                <w:color w:val="FFFFFF"/>
-                <w:sz w:val="19"/>
-              </w:rPr>
-              <w:t>Implementation</w:t>
-            </w:r>
-          </w:p>
-        </w:tc>
-        <w:tc>
-          <w:tcPr>
-            <w:tcW w:type="dxa" w:w="5760"/>
-            <w:vAlign w:val="center"/>
-            <w:tcMar>
-              <w:top w:w="120" w:type="dxa"/>
-              <w:start w:w="130" w:type="dxa"/>
-              <w:bottom w:w="120" w:type="dxa"/>
-              <w:end w:w="130" w:type="dxa"/>
-            </w:tcMar>
-            <w:shd w:fill="1F4E78"/>
-          </w:tcPr>
-          <w:p>
-            <w:pPr>
-              <w:spacing w:after="0" w:line="252" w:lineRule="auto"/>
-            </w:pPr>
-            <w:r>
-              <w:rPr>
-                <w:rFonts w:ascii="Arial" w:hAnsi="Arial"/>
-                <w:b/>
-                <w:color w:val="FFFFFF"/>
-                <w:sz w:val="19"/>
-              </w:rPr>
-              <w:t>Responsibility</w:t>
-            </w:r>
-          </w:p>
-        </w:tc>
-      </w:tr>
-      <w:tr>
-        <w:tc>
-          <w:tcPr>
-            <w:tcW w:type="dxa" w:w="1843"/>
-            <w:vAlign w:val="center"/>
-            <w:tcMar>
-              <w:top w:w="120" w:type="dxa"/>
-              <w:start w:w="130" w:type="dxa"/>
-              <w:bottom w:w="120" w:type="dxa"/>
-              <w:end w:w="130" w:type="dxa"/>
-            </w:tcMar>
-          </w:tcPr>
-          <w:p>
-            <w:pPr>
-              <w:spacing w:after="0" w:line="252" w:lineRule="auto"/>
-            </w:pPr>
-            <w:r>
-              <w:rPr>
-                <w:rFonts w:ascii="Arial" w:hAnsi="Arial"/>
-                <w:b w:val="0"/>
-                <w:color w:val="000000"/>
-                <w:sz w:val="19"/>
-              </w:rPr>
-              <w:t>Product</w:t>
-            </w:r>
-          </w:p>
-        </w:tc>
-        <w:tc>
-          <w:tcPr>
-            <w:tcW w:type="dxa" w:w="2232"/>
-            <w:vAlign w:val="center"/>
-            <w:tcMar>
-              <w:top w:w="120" w:type="dxa"/>
-              <w:start w:w="130" w:type="dxa"/>
-              <w:bottom w:w="120" w:type="dxa"/>
-              <w:end w:w="130" w:type="dxa"/>
-            </w:tcMar>
-          </w:tcPr>
-          <w:p>
-            <w:pPr>
-              <w:spacing w:after="0" w:line="252" w:lineRule="auto"/>
-            </w:pPr>
-            <w:r>
-              <w:rPr>
-                <w:rFonts w:ascii="Arial" w:hAnsi="Arial"/>
-                <w:b w:val="0"/>
-                <w:color w:val="000000"/>
-                <w:sz w:val="19"/>
-              </w:rPr>
-              <w:t>Car</w:t>
-            </w:r>
-          </w:p>
-        </w:tc>
-        <w:tc>
-          <w:tcPr>
-            <w:tcW w:type="dxa" w:w="5760"/>
-            <w:vAlign w:val="center"/>
-            <w:tcMar>
-              <w:top w:w="120" w:type="dxa"/>
-              <w:start w:w="130" w:type="dxa"/>
-              <w:bottom w:w="120" w:type="dxa"/>
-              <w:end w:w="130" w:type="dxa"/>
-            </w:tcMar>
-          </w:tcPr>
-          <w:p>
-            <w:pPr>
-              <w:spacing w:after="0" w:line="252" w:lineRule="auto"/>
-            </w:pPr>
-            <w:r>
-              <w:rPr>
-                <w:rFonts w:ascii="Arial" w:hAnsi="Arial"/>
-                <w:b w:val="0"/>
-                <w:color w:val="000000"/>
-                <w:sz w:val="19"/>
-              </w:rPr>
-              <w:t>Stores the finished immutable configuration.</w:t>
-            </w:r>
-          </w:p>
-        </w:tc>
-      </w:tr>
-      <w:tr>
-        <w:tc>
-          <w:tcPr>
-            <w:tcW w:type="dxa" w:w="1843"/>
-            <w:vAlign w:val="center"/>
-            <w:tcMar>
-              <w:top w:w="120" w:type="dxa"/>
-              <w:start w:w="130" w:type="dxa"/>
-              <w:bottom w:w="120" w:type="dxa"/>
-              <w:end w:w="130" w:type="dxa"/>
-            </w:tcMar>
-            <w:shd w:fill="EAF2F8"/>
-          </w:tcPr>
-          <w:p>
-            <w:pPr>
-              <w:spacing w:after="0" w:line="252" w:lineRule="auto"/>
-            </w:pPr>
-            <w:r>
-              <w:rPr>
-                <w:rFonts w:ascii="Arial" w:hAnsi="Arial"/>
-                <w:b w:val="0"/>
-                <w:color w:val="000000"/>
-                <w:sz w:val="19"/>
-              </w:rPr>
-              <w:t>Builder</w:t>
-            </w:r>
-          </w:p>
-        </w:tc>
-        <w:tc>
-          <w:tcPr>
-            <w:tcW w:type="dxa" w:w="2232"/>
-            <w:vAlign w:val="center"/>
-            <w:tcMar>
-              <w:top w:w="120" w:type="dxa"/>
-              <w:start w:w="130" w:type="dxa"/>
-              <w:bottom w:w="120" w:type="dxa"/>
-              <w:end w:w="130" w:type="dxa"/>
-            </w:tcMar>
-            <w:shd w:fill="EAF2F8"/>
-          </w:tcPr>
-          <w:p>
-            <w:pPr>
-              <w:spacing w:after="0" w:line="252" w:lineRule="auto"/>
-            </w:pPr>
-            <w:r>
-              <w:rPr>
-                <w:rFonts w:ascii="Arial" w:hAnsi="Arial"/>
-                <w:b w:val="0"/>
-                <w:color w:val="000000"/>
-                <w:sz w:val="19"/>
-              </w:rPr>
-              <w:t>CarBuilder</w:t>
-            </w:r>
-          </w:p>
-        </w:tc>
-        <w:tc>
-          <w:tcPr>
-            <w:tcW w:type="dxa" w:w="5760"/>
-            <w:vAlign w:val="center"/>
-            <w:tcMar>
-              <w:top w:w="120" w:type="dxa"/>
-              <w:start w:w="130" w:type="dxa"/>
-              <w:bottom w:w="120" w:type="dxa"/>
-              <w:end w:w="130" w:type="dxa"/>
-            </w:tcMar>
-            <w:shd w:fill="EAF2F8"/>
-          </w:tcPr>
-          <w:p>
-            <w:pPr>
-              <w:spacing w:after="0" w:line="252" w:lineRule="auto"/>
-            </w:pPr>
-            <w:r>
-              <w:rPr>
-                <w:rFonts w:ascii="Arial" w:hAnsi="Arial"/>
-                <w:b w:val="0"/>
-                <w:color w:val="000000"/>
-                <w:sz w:val="19"/>
-              </w:rPr>
-              <w:t>Declares every fluent construction step and build().</w:t>
-            </w:r>
-          </w:p>
-        </w:tc>
-      </w:tr>
-      <w:tr>
-        <w:tc>
-          <w:tcPr>
-            <w:tcW w:type="dxa" w:w="1843"/>
-            <w:vAlign w:val="center"/>
-            <w:tcMar>
-              <w:top w:w="120" w:type="dxa"/>
-              <w:start w:w="130" w:type="dxa"/>
-              <w:bottom w:w="120" w:type="dxa"/>
-              <w:end w:w="130" w:type="dxa"/>
-            </w:tcMar>
-          </w:tcPr>
-          <w:p>
-            <w:pPr>
-              <w:spacing w:after="0" w:line="252" w:lineRule="auto"/>
-            </w:pPr>
-            <w:r>
-              <w:rPr>
-                <w:rFonts w:ascii="Arial" w:hAnsi="Arial"/>
-                <w:b w:val="0"/>
-                <w:color w:val="000000"/>
-                <w:sz w:val="19"/>
-              </w:rPr>
-              <w:t>Shared implementation</w:t>
-            </w:r>
-          </w:p>
-        </w:tc>
-        <w:tc>
-          <w:tcPr>
-            <w:tcW w:type="dxa" w:w="2232"/>
-            <w:vAlign w:val="center"/>
-            <w:tcMar>
-              <w:top w:w="120" w:type="dxa"/>
-              <w:start w:w="130" w:type="dxa"/>
-              <w:bottom w:w="120" w:type="dxa"/>
-              <w:end w:w="130" w:type="dxa"/>
-            </w:tcMar>
-          </w:tcPr>
-          <w:p>
-            <w:pPr>
-              <w:spacing w:after="0" w:line="252" w:lineRule="auto"/>
-            </w:pPr>
-            <w:r>
-              <w:rPr>
-                <w:rFonts w:ascii="Arial" w:hAnsi="Arial"/>
-                <w:b w:val="0"/>
-                <w:color w:val="000000"/>
-                <w:sz w:val="19"/>
-              </w:rPr>
-              <w:t>AbstractCarBuilder</w:t>
-            </w:r>
-          </w:p>
-        </w:tc>
-        <w:tc>
-          <w:tcPr>
-            <w:tcW w:type="dxa" w:w="5760"/>
-            <w:vAlign w:val="center"/>
-            <w:tcMar>
-              <w:top w:w="120" w:type="dxa"/>
-              <w:start w:w="130" w:type="dxa"/>
-              <w:bottom w:w="120" w:type="dxa"/>
-              <w:end w:w="130" w:type="dxa"/>
-            </w:tcMar>
-          </w:tcPr>
-          <w:p>
-            <w:pPr>
-              <w:spacing w:after="0" w:line="252" w:lineRule="auto"/>
-            </w:pPr>
-            <w:r>
-              <w:rPr>
-                <w:rFonts w:ascii="Arial" w:hAnsi="Arial"/>
-                <w:b w:val="0"/>
-                <w:color w:val="000000"/>
-                <w:sz w:val="19"/>
-              </w:rPr>
-              <w:t>Stores state and centralizes common setters and validation.</w:t>
-            </w:r>
-          </w:p>
-        </w:tc>
-      </w:tr>
-      <w:tr>
-        <w:tc>
-          <w:tcPr>
-            <w:tcW w:type="dxa" w:w="1843"/>
-            <w:vAlign w:val="center"/>
-            <w:tcMar>
-              <w:top w:w="120" w:type="dxa"/>
-              <w:start w:w="130" w:type="dxa"/>
-              <w:bottom w:w="120" w:type="dxa"/>
-              <w:end w:w="130" w:type="dxa"/>
-            </w:tcMar>
-            <w:shd w:fill="EAF2F8"/>
-          </w:tcPr>
-          <w:p>
-            <w:pPr>
-              <w:spacing w:after="0" w:line="252" w:lineRule="auto"/>
-            </w:pPr>
-            <w:r>
-              <w:rPr>
-                <w:rFonts w:ascii="Arial" w:hAnsi="Arial"/>
-                <w:b w:val="0"/>
-                <w:color w:val="000000"/>
-                <w:sz w:val="19"/>
-              </w:rPr>
-              <w:t>Concrete Builder</w:t>
-            </w:r>
-          </w:p>
-        </w:tc>
-        <w:tc>
-          <w:tcPr>
-            <w:tcW w:type="dxa" w:w="2232"/>
-            <w:vAlign w:val="center"/>
-            <w:tcMar>
-              <w:top w:w="120" w:type="dxa"/>
-              <w:start w:w="130" w:type="dxa"/>
-              <w:bottom w:w="120" w:type="dxa"/>
-              <w:end w:w="130" w:type="dxa"/>
-            </w:tcMar>
-            <w:shd w:fill="EAF2F8"/>
-          </w:tcPr>
-          <w:p>
-            <w:pPr>
-              <w:spacing w:after="0" w:line="252" w:lineRule="auto"/>
-            </w:pPr>
-            <w:r>
-              <w:rPr>
-                <w:rFonts w:ascii="Arial" w:hAnsi="Arial"/>
-                <w:b w:val="0"/>
-                <w:color w:val="000000"/>
-                <w:sz w:val="19"/>
-              </w:rPr>
-              <w:t>PassengerCarBuilder</w:t>
-            </w:r>
-          </w:p>
-        </w:tc>
-        <w:tc>
-          <w:tcPr>
-            <w:tcW w:type="dxa" w:w="5760"/>
-            <w:vAlign w:val="center"/>
-            <w:tcMar>
-              <w:top w:w="120" w:type="dxa"/>
-              <w:start w:w="130" w:type="dxa"/>
-              <w:bottom w:w="120" w:type="dxa"/>
-              <w:end w:w="130" w:type="dxa"/>
-            </w:tcMar>
-            <w:shd w:fill="EAF2F8"/>
-          </w:tcPr>
-          <w:p>
-            <w:pPr>
-              <w:spacing w:after="0" w:line="252" w:lineRule="auto"/>
-            </w:pPr>
-            <w:r>
-              <w:rPr>
-                <w:rFonts w:ascii="Arial" w:hAnsi="Arial"/>
-                <w:b w:val="0"/>
-                <w:color w:val="000000"/>
-                <w:sz w:val="19"/>
-              </w:rPr>
-              <w:t>Produces cars intended for normal passenger use.</w:t>
-            </w:r>
-          </w:p>
-        </w:tc>
-      </w:tr>
-      <w:tr>
-        <w:tc>
-          <w:tcPr>
-            <w:tcW w:type="dxa" w:w="1843"/>
-            <w:vAlign w:val="center"/>
-            <w:tcMar>
-              <w:top w:w="120" w:type="dxa"/>
-              <w:start w:w="130" w:type="dxa"/>
-              <w:bottom w:w="120" w:type="dxa"/>
-              <w:end w:w="130" w:type="dxa"/>
-            </w:tcMar>
-          </w:tcPr>
-          <w:p>
-            <w:pPr>
-              <w:spacing w:after="0" w:line="252" w:lineRule="auto"/>
-            </w:pPr>
-            <w:r>
-              <w:rPr>
-                <w:rFonts w:ascii="Arial" w:hAnsi="Arial"/>
-                <w:b w:val="0"/>
-                <w:color w:val="000000"/>
-                <w:sz w:val="19"/>
-              </w:rPr>
-              <w:t>Concrete Builder</w:t>
-            </w:r>
-          </w:p>
-        </w:tc>
-        <w:tc>
-          <w:tcPr>
-            <w:tcW w:type="dxa" w:w="2232"/>
-            <w:vAlign w:val="center"/>
-            <w:tcMar>
-              <w:top w:w="120" w:type="dxa"/>
-              <w:start w:w="130" w:type="dxa"/>
-              <w:bottom w:w="120" w:type="dxa"/>
-              <w:end w:w="130" w:type="dxa"/>
-            </w:tcMar>
-          </w:tcPr>
-          <w:p>
-            <w:pPr>
-              <w:spacing w:after="0" w:line="252" w:lineRule="auto"/>
-            </w:pPr>
-            <w:r>
-              <w:rPr>
-                <w:rFonts w:ascii="Arial" w:hAnsi="Arial"/>
-                <w:b w:val="0"/>
-                <w:color w:val="000000"/>
-                <w:sz w:val="19"/>
-              </w:rPr>
-              <w:t>SportsCarBuilder</w:t>
-            </w:r>
-          </w:p>
-        </w:tc>
-        <w:tc>
-          <w:tcPr>
-            <w:tcW w:type="dxa" w:w="5760"/>
-            <w:vAlign w:val="center"/>
-            <w:tcMar>
-              <w:top w:w="120" w:type="dxa"/>
-              <w:start w:w="130" w:type="dxa"/>
-              <w:bottom w:w="120" w:type="dxa"/>
-              <w:end w:w="130" w:type="dxa"/>
-            </w:tcMar>
-          </w:tcPr>
-          <w:p>
-            <w:pPr>
-              <w:spacing w:after="0" w:line="252" w:lineRule="auto"/>
-            </w:pPr>
-            <w:r>
-              <w:rPr>
-                <w:rFonts w:ascii="Arial" w:hAnsi="Arial"/>
-                <w:b w:val="0"/>
-                <w:color w:val="000000"/>
-                <w:sz w:val="19"/>
-              </w:rPr>
-              <w:t>Produces high-performance cars with stricter rules.</w:t>
-            </w:r>
-          </w:p>
-        </w:tc>
-      </w:tr>
-      <w:tr>
-        <w:tc>
-          <w:tcPr>
-            <w:tcW w:type="dxa" w:w="1843"/>
-            <w:vAlign w:val="center"/>
-            <w:tcMar>
-              <w:top w:w="120" w:type="dxa"/>
-              <w:start w:w="130" w:type="dxa"/>
-              <w:bottom w:w="120" w:type="dxa"/>
-              <w:end w:w="130" w:type="dxa"/>
-            </w:tcMar>
-            <w:shd w:fill="EAF2F8"/>
-          </w:tcPr>
-          <w:p>
-            <w:pPr>
-              <w:spacing w:after="0" w:line="252" w:lineRule="auto"/>
-            </w:pPr>
-            <w:r>
-              <w:rPr>
-                <w:rFonts w:ascii="Arial" w:hAnsi="Arial"/>
-                <w:b w:val="0"/>
-                <w:color w:val="000000"/>
-                <w:sz w:val="19"/>
-              </w:rPr>
-              <w:t>Director</w:t>
-            </w:r>
-          </w:p>
-        </w:tc>
-        <w:tc>
-          <w:tcPr>
-            <w:tcW w:type="dxa" w:w="2232"/>
-            <w:vAlign w:val="center"/>
-            <w:tcMar>
-              <w:top w:w="120" w:type="dxa"/>
-              <w:start w:w="130" w:type="dxa"/>
-              <w:bottom w:w="120" w:type="dxa"/>
-              <w:end w:w="130" w:type="dxa"/>
-            </w:tcMar>
-            <w:shd w:fill="EAF2F8"/>
-          </w:tcPr>
-          <w:p>
-            <w:pPr>
-              <w:spacing w:after="0" w:line="252" w:lineRule="auto"/>
-            </w:pPr>
-            <w:r>
-              <w:rPr>
-                <w:rFonts w:ascii="Arial" w:hAnsi="Arial"/>
-                <w:b w:val="0"/>
-                <w:color w:val="000000"/>
-                <w:sz w:val="19"/>
-              </w:rPr>
-              <w:t>CarDirector</w:t>
-            </w:r>
-          </w:p>
-        </w:tc>
-        <w:tc>
-          <w:tcPr>
-            <w:tcW w:type="dxa" w:w="5760"/>
-            <w:vAlign w:val="center"/>
-            <w:tcMar>
-              <w:top w:w="120" w:type="dxa"/>
-              <w:start w:w="130" w:type="dxa"/>
-              <w:bottom w:w="120" w:type="dxa"/>
-              <w:end w:w="130" w:type="dxa"/>
-            </w:tcMar>
-            <w:shd w:fill="EAF2F8"/>
-          </w:tcPr>
-          <w:p>
-            <w:pPr>
-              <w:spacing w:after="0" w:line="252" w:lineRule="auto"/>
-            </w:pPr>
-            <w:r>
-              <w:rPr>
-                <w:rFonts w:ascii="Arial" w:hAnsi="Arial"/>
-                <w:b w:val="0"/>
-                <w:color w:val="000000"/>
-                <w:sz w:val="19"/>
-              </w:rPr>
-              <w:t>Runs reusable family-car and sports-car build sequences.</w:t>
-            </w:r>
-          </w:p>
-        </w:tc>
-      </w:tr>
-      <w:tr>
-        <w:tc>
-          <w:tcPr>
-            <w:tcW w:type="dxa" w:w="1843"/>
-            <w:vAlign w:val="center"/>
-            <w:tcMar>
-              <w:top w:w="120" w:type="dxa"/>
-              <w:start w:w="130" w:type="dxa"/>
-              <w:bottom w:w="120" w:type="dxa"/>
-              <w:end w:w="130" w:type="dxa"/>
-            </w:tcMar>
-          </w:tcPr>
-          <w:p>
-            <w:pPr>
-              <w:spacing w:after="0" w:line="252" w:lineRule="auto"/>
-            </w:pPr>
-            <w:r>
-              <w:rPr>
-                <w:rFonts w:ascii="Arial" w:hAnsi="Arial"/>
-                <w:b w:val="0"/>
-                <w:color w:val="000000"/>
-                <w:sz w:val="19"/>
-              </w:rPr>
-              <w:t>Client</w:t>
-            </w:r>
-          </w:p>
-        </w:tc>
-        <w:tc>
-          <w:tcPr>
-            <w:tcW w:type="dxa" w:w="2232"/>
-            <w:vAlign w:val="center"/>
-            <w:tcMar>
-              <w:top w:w="120" w:type="dxa"/>
-              <w:start w:w="130" w:type="dxa"/>
-              <w:bottom w:w="120" w:type="dxa"/>
-              <w:end w:w="130" w:type="dxa"/>
-            </w:tcMar>
-          </w:tcPr>
-          <w:p>
-            <w:pPr>
-              <w:spacing w:after="0" w:line="252" w:lineRule="auto"/>
-            </w:pPr>
-            <w:r>
-              <w:rPr>
-                <w:rFonts w:ascii="Arial" w:hAnsi="Arial"/>
-                <w:b w:val="0"/>
-                <w:color w:val="000000"/>
-                <w:sz w:val="19"/>
-              </w:rPr>
-              <w:t>Main</w:t>
-            </w:r>
-          </w:p>
-        </w:tc>
-        <w:tc>
-          <w:tcPr>
-            <w:tcW w:type="dxa" w:w="5760"/>
-            <w:vAlign w:val="center"/>
-            <w:tcMar>
-              <w:top w:w="120" w:type="dxa"/>
-              <w:start w:w="130" w:type="dxa"/>
-              <w:bottom w:w="120" w:type="dxa"/>
-              <w:end w:w="130" w:type="dxa"/>
-            </w:tcMar>
-          </w:tcPr>
-          <w:p>
-            <w:pPr>
-              <w:spacing w:after="0" w:line="252" w:lineRule="auto"/>
-            </w:pPr>
-            <w:r>
-              <w:rPr>
-                <w:rFonts w:ascii="Arial" w:hAnsi="Arial"/>
-                <w:b w:val="0"/>
-                <w:color w:val="000000"/>
-                <w:sz w:val="19"/>
-              </w:rPr>
-              <w:t>Selects builders, requests products, and prints the results.</w:t>
-            </w:r>
-          </w:p>
-        </w:tc>
-      </w:tr>
-    </w:tbl>
-    <w:p>
-      <w:pPr>
-        <w:spacing w:after="0"/>
-      </w:pPr>
-    </w:p>
-    <w:p>
-      <w:pPr>
-        <w:pStyle w:val="Heading2"/>
-        <w:keepNext/>
-      </w:pPr>
-      <w:r>
-        <w:t>Construction Flow</w:t>
+        <w:t>2 Implementation</w:t>
       </w:r>
     </w:p>
     <w:p>
       <w:pPr>
-        <w:pStyle w:val="ListBullet"/>
+        <w:spacing w:line="276" w:lineRule="auto" w:after="120"/>
+        <w:ind w:firstLine="576"/>
+        <w:jc w:val="both"/>
       </w:pPr>
       <w:r>
-        <w:t>The client selects a concrete builder.</w:t>
+        <w:rPr>
+          <w:rFonts w:ascii="Times New Roman" w:hAnsi="Times New Roman"/>
+          <w:b w:val="0"/>
+          <w:i w:val="0"/>
+          <w:color w:val="000000"/>
+          <w:sz w:val="24"/>
+        </w:rPr>
+        <w:t>Car is the Product class. CarBuilder is an abstract Builder class that stores temporary values and provides the common setter methods. PassengerCarBuilder and SportsCarBuilder are the two Concrete Builders. CarDirector contains two ready construction sequences, and Main is the Client that runs the program and prints the results.</w:t>
       </w:r>
     </w:p>
     <w:p>
       <w:pPr>
-        <w:pStyle w:val="ListBullet"/>
+        <w:spacing w:line="276" w:lineRule="auto" w:after="120"/>
+        <w:ind w:firstLine="576"/>
+        <w:jc w:val="both"/>
       </w:pPr>
       <w:r>
-        <w:t>The client or Director calls named configuration methods in the required sequence.</w:t>
+        <w:rPr>
+          <w:rFonts w:ascii="Times New Roman" w:hAnsi="Times New Roman"/>
+          <w:b w:val="0"/>
+          <w:i w:val="0"/>
+          <w:color w:val="000000"/>
+          <w:sz w:val="24"/>
+        </w:rPr>
+        <w:t>The setter methods return the builder object. Because of this, the methods can be called one after another. This is called method chaining or a fluent API.</w:t>
       </w:r>
     </w:p>
     <w:p>
       <w:pPr>
-        <w:pStyle w:val="ListBullet"/>
+        <w:keepLines/>
+        <w:spacing w:before="60" w:after="160" w:line="240" w:lineRule="auto"/>
+        <w:ind w:left="648"/>
       </w:pPr>
       <w:r>
-        <w:t>Each method stores one value and returns the builder, which enables method chaining.</w:t>
-      </w:r>
-    </w:p>
-    <w:p>
-      <w:pPr>
-        <w:pStyle w:val="ListBullet"/>
-      </w:pPr>
-      <w:r>
-        <w:t>build() checks common rules and rules specific to the selected representation.</w:t>
-      </w:r>
-    </w:p>
-    <w:p>
-      <w:pPr>
-        <w:pStyle w:val="ListBullet"/>
-      </w:pPr>
-      <w:r>
-        <w:t>The builder creates an immutable Car and resets its temporary state for safe reuse.</w:t>
-      </w:r>
-    </w:p>
-    <w:p>
-      <w:r>
-        <w:br w:type="page"/>
+        <w:rPr>
+          <w:rFonts w:ascii="Courier New" w:hAnsi="Courier New"/>
+          <w:b w:val="0"/>
+          <w:i w:val="0"/>
+          <w:color w:val="000000"/>
+          <w:sz w:val="19"/>
+        </w:rPr>
+        <w:t>return builder</w:t>
+        <w:br/>
+        <w:t xml:space="preserve">        .setModel("Toyota Camry")</w:t>
+        <w:br/>
+        <w:t xml:space="preserve">        .setEngine("2.5L Hybrid", 218)</w:t>
+        <w:br/>
+        <w:t xml:space="preserve">        .setSeats(5)</w:t>
+        <w:br/>
+        <w:t xml:space="preserve">        .setTransmission("Automatic")</w:t>
+        <w:br/>
+        <w:t xml:space="preserve">        .setColor("White")</w:t>
+        <w:br/>
+        <w:t xml:space="preserve">        .addFeature("Air conditioning")</w:t>
+        <w:br/>
+        <w:t xml:space="preserve">        .addFeature("Parking camera")</w:t>
+        <w:br/>
+        <w:t xml:space="preserve">        .build();</w:t>
       </w:r>
     </w:p>
     <w:p>
       <w:pPr>
         <w:pStyle w:val="Heading1"/>
         <w:keepNext/>
+        <w:spacing w:before="240" w:after="100"/>
       </w:pPr>
       <w:r>
         <w:t>3 UML Class Diagram</w:t>
       </w:r>
     </w:p>
     <w:p>
+      <w:pPr>
+        <w:spacing w:line="276" w:lineRule="auto" w:after="120"/>
+        <w:ind w:firstLine="576"/>
+        <w:jc w:val="both"/>
+      </w:pPr>
       <w:r>
-        <w:t>The diagram shows realization and inheritance with solid triangular arrows. Dashed arrows show dependencies: the Director works through CarBuilder, Main uses the Director and builders, and AbstractCarBuilder creates the Car product.</w:t>
+        <w:rPr>
+          <w:rFonts w:ascii="Times New Roman" w:hAnsi="Times New Roman"/>
+          <w:b w:val="0"/>
+          <w:i w:val="0"/>
+          <w:color w:val="000000"/>
+          <w:sz w:val="24"/>
+        </w:rPr>
+        <w:t>Figure 1 shows the main classes and their relationships. The two concrete builders inherit from CarBuilder. CarBuilder creates the Car product. CarDirector uses CarBuilder, while Main uses the Director.</w:t>
       </w:r>
     </w:p>
     <w:p>
       <w:pPr>
-        <w:spacing w:before="160" w:after="80"/>
+        <w:spacing w:before="80" w:after="60"/>
         <w:jc w:val="center"/>
       </w:pPr>
       <w:r>
         <w:drawing>
           <wp:inline xmlns:a="http://schemas.openxmlformats.org/drawingml/2006/main" xmlns:pic="http://schemas.openxmlformats.org/drawingml/2006/picture">
-            <wp:extent cx="6172200" cy="4114800"/>
+            <wp:extent cx="5943600" cy="3714750"/>
             <wp:docPr id="1" name="Picture 1"/>
             <wp:cNvGraphicFramePr>
               <a:graphicFrameLocks noChangeAspect="1"/>
@@ -1016,7 +313,7 @@
                   <pic:spPr>
                     <a:xfrm>
                       <a:off x="0" y="0"/>
-                      <a:ext cx="6172200" cy="4114800"/>
+                      <a:ext cx="5943600" cy="3714750"/>
                     </a:xfrm>
                     <a:prstGeom prst="rect"/>
                   </pic:spPr>
@@ -1029,760 +326,141 @@
     </w:p>
     <w:p>
       <w:pPr>
-        <w:spacing w:after="200"/>
+        <w:spacing w:after="160"/>
         <w:jc w:val="center"/>
       </w:pPr>
       <w:r>
         <w:rPr>
-          <w:rFonts w:ascii="Arial" w:hAnsi="Arial"/>
+          <w:rFonts w:ascii="Times New Roman" w:hAnsi="Times New Roman"/>
+          <w:b w:val="0"/>
           <w:i/>
           <w:color w:val="000000"/>
-          <w:sz w:val="19"/>
+          <w:sz w:val="22"/>
         </w:rPr>
-        <w:t>Figure 1  UML class diagram of the Car Builder implementation</w:t>
+        <w:t>Figure 1  UML class diagram</w:t>
+      </w:r>
+    </w:p>
+    <w:p>
+      <w:pPr>
+        <w:pStyle w:val="Heading1"/>
+        <w:keepNext/>
+        <w:spacing w:before="240" w:after="100"/>
+      </w:pPr>
+      <w:r>
+        <w:t>4 Clean Code Principles</w:t>
+      </w:r>
+    </w:p>
+    <w:p>
+      <w:pPr>
+        <w:spacing w:line="276" w:lineRule="auto" w:after="120"/>
+        <w:ind w:firstLine="576"/>
+        <w:jc w:val="both"/>
+      </w:pPr>
+      <w:r>
+        <w:rPr>
+          <w:rFonts w:ascii="Times New Roman" w:hAnsi="Times New Roman"/>
+          <w:b w:val="0"/>
+          <w:i w:val="0"/>
+          <w:color w:val="000000"/>
+          <w:sz w:val="24"/>
+        </w:rPr>
+        <w:t>I applied the following Clean Code principles in the project. The examples below are taken from the source code.</w:t>
       </w:r>
     </w:p>
     <w:p>
       <w:pPr>
         <w:pStyle w:val="Heading2"/>
         <w:keepNext/>
+        <w:spacing w:before="160" w:after="100"/>
       </w:pPr>
       <w:r>
-        <w:t>Two Product Representations</w:t>
+        <w:t>4 1 Meaningful Names</w:t>
       </w:r>
-    </w:p>
-    <w:tbl>
-      <w:tblPr>
-        <w:tblW w:type="auto" w:w="0"/>
-        <w:jc w:val="center"/>
-        <w:tblLayout w:type="fixed"/>
-        <w:tblLook w:firstColumn="1" w:firstRow="1" w:lastColumn="0" w:lastRow="0" w:noHBand="0" w:noVBand="1" w:val="04A0"/>
-        <w:tblBorders>
-          <w:top w:val="single" w:sz="8" w:space="0" w:color="D9D9D9"/>
-          <w:left w:val="single" w:sz="8" w:space="0" w:color="D9D9D9"/>
-          <w:bottom w:val="single" w:sz="8" w:space="0" w:color="D9D9D9"/>
-          <w:right w:val="single" w:sz="8" w:space="0" w:color="D9D9D9"/>
-          <w:insideH w:val="single" w:sz="8" w:space="0" w:color="D9D9D9"/>
-          <w:insideV w:val="single" w:sz="8" w:space="0" w:color="D9D9D9"/>
-        </w:tblBorders>
-      </w:tblPr>
-      <w:tblGrid>
-        <w:gridCol w:w="3331"/>
-        <w:gridCol w:w="3331"/>
-        <w:gridCol w:w="3331"/>
-      </w:tblGrid>
-      <w:tr>
-        <w:trPr>
-          <w:tblHeader w:val="true"/>
-        </w:trPr>
-        <w:tc>
-          <w:tcPr>
-            <w:tcW w:type="dxa" w:w="2376"/>
-            <w:vAlign w:val="center"/>
-            <w:tcMar>
-              <w:top w:w="120" w:type="dxa"/>
-              <w:start w:w="130" w:type="dxa"/>
-              <w:bottom w:w="120" w:type="dxa"/>
-              <w:end w:w="130" w:type="dxa"/>
-            </w:tcMar>
-            <w:shd w:fill="1F4E78"/>
-          </w:tcPr>
-          <w:p>
-            <w:pPr>
-              <w:spacing w:after="0" w:line="252" w:lineRule="auto"/>
-            </w:pPr>
-            <w:r>
-              <w:rPr>
-                <w:rFonts w:ascii="Arial" w:hAnsi="Arial"/>
-                <w:b/>
-                <w:color w:val="FFFFFF"/>
-                <w:sz w:val="19"/>
-              </w:rPr>
-              <w:t>Characteristic</w:t>
-            </w:r>
-          </w:p>
-        </w:tc>
-        <w:tc>
-          <w:tcPr>
-            <w:tcW w:type="dxa" w:w="3672"/>
-            <w:vAlign w:val="center"/>
-            <w:tcMar>
-              <w:top w:w="120" w:type="dxa"/>
-              <w:start w:w="130" w:type="dxa"/>
-              <w:bottom w:w="120" w:type="dxa"/>
-              <w:end w:w="130" w:type="dxa"/>
-            </w:tcMar>
-            <w:shd w:fill="1F4E78"/>
-          </w:tcPr>
-          <w:p>
-            <w:pPr>
-              <w:spacing w:after="0" w:line="252" w:lineRule="auto"/>
-            </w:pPr>
-            <w:r>
-              <w:rPr>
-                <w:rFonts w:ascii="Arial" w:hAnsi="Arial"/>
-                <w:b/>
-                <w:color w:val="FFFFFF"/>
-                <w:sz w:val="19"/>
-              </w:rPr>
-              <w:t>Passenger car</w:t>
-            </w:r>
-          </w:p>
-        </w:tc>
-        <w:tc>
-          <w:tcPr>
-            <w:tcW w:type="dxa" w:w="3672"/>
-            <w:vAlign w:val="center"/>
-            <w:tcMar>
-              <w:top w:w="120" w:type="dxa"/>
-              <w:start w:w="130" w:type="dxa"/>
-              <w:bottom w:w="120" w:type="dxa"/>
-              <w:end w:w="130" w:type="dxa"/>
-            </w:tcMar>
-            <w:shd w:fill="1F4E78"/>
-          </w:tcPr>
-          <w:p>
-            <w:pPr>
-              <w:spacing w:after="0" w:line="252" w:lineRule="auto"/>
-            </w:pPr>
-            <w:r>
-              <w:rPr>
-                <w:rFonts w:ascii="Arial" w:hAnsi="Arial"/>
-                <w:b/>
-                <w:color w:val="FFFFFF"/>
-                <w:sz w:val="19"/>
-              </w:rPr>
-              <w:t>Sports car</w:t>
-            </w:r>
-          </w:p>
-        </w:tc>
-      </w:tr>
-      <w:tr>
-        <w:tc>
-          <w:tcPr>
-            <w:tcW w:type="dxa" w:w="2376"/>
-            <w:vAlign w:val="center"/>
-            <w:tcMar>
-              <w:top w:w="120" w:type="dxa"/>
-              <w:start w:w="130" w:type="dxa"/>
-              <w:bottom w:w="120" w:type="dxa"/>
-              <w:end w:w="130" w:type="dxa"/>
-            </w:tcMar>
-          </w:tcPr>
-          <w:p>
-            <w:pPr>
-              <w:spacing w:after="0" w:line="252" w:lineRule="auto"/>
-            </w:pPr>
-            <w:r>
-              <w:rPr>
-                <w:rFonts w:ascii="Arial" w:hAnsi="Arial"/>
-                <w:b w:val="0"/>
-                <w:color w:val="000000"/>
-                <w:sz w:val="19"/>
-              </w:rPr>
-              <w:t>Concrete builder</w:t>
-            </w:r>
-          </w:p>
-        </w:tc>
-        <w:tc>
-          <w:tcPr>
-            <w:tcW w:type="dxa" w:w="3672"/>
-            <w:vAlign w:val="center"/>
-            <w:tcMar>
-              <w:top w:w="120" w:type="dxa"/>
-              <w:start w:w="130" w:type="dxa"/>
-              <w:bottom w:w="120" w:type="dxa"/>
-              <w:end w:w="130" w:type="dxa"/>
-            </w:tcMar>
-          </w:tcPr>
-          <w:p>
-            <w:pPr>
-              <w:spacing w:after="0" w:line="252" w:lineRule="auto"/>
-            </w:pPr>
-            <w:r>
-              <w:rPr>
-                <w:rFonts w:ascii="Arial" w:hAnsi="Arial"/>
-                <w:b w:val="0"/>
-                <w:color w:val="000000"/>
-                <w:sz w:val="19"/>
-              </w:rPr>
-              <w:t>PassengerCarBuilder</w:t>
-            </w:r>
-          </w:p>
-        </w:tc>
-        <w:tc>
-          <w:tcPr>
-            <w:tcW w:type="dxa" w:w="3672"/>
-            <w:vAlign w:val="center"/>
-            <w:tcMar>
-              <w:top w:w="120" w:type="dxa"/>
-              <w:start w:w="130" w:type="dxa"/>
-              <w:bottom w:w="120" w:type="dxa"/>
-              <w:end w:w="130" w:type="dxa"/>
-            </w:tcMar>
-          </w:tcPr>
-          <w:p>
-            <w:pPr>
-              <w:spacing w:after="0" w:line="252" w:lineRule="auto"/>
-            </w:pPr>
-            <w:r>
-              <w:rPr>
-                <w:rFonts w:ascii="Arial" w:hAnsi="Arial"/>
-                <w:b w:val="0"/>
-                <w:color w:val="000000"/>
-                <w:sz w:val="19"/>
-              </w:rPr>
-              <w:t>SportsCarBuilder</w:t>
-            </w:r>
-          </w:p>
-        </w:tc>
-      </w:tr>
-      <w:tr>
-        <w:tc>
-          <w:tcPr>
-            <w:tcW w:type="dxa" w:w="2376"/>
-            <w:vAlign w:val="center"/>
-            <w:tcMar>
-              <w:top w:w="120" w:type="dxa"/>
-              <w:start w:w="130" w:type="dxa"/>
-              <w:bottom w:w="120" w:type="dxa"/>
-              <w:end w:w="130" w:type="dxa"/>
-            </w:tcMar>
-            <w:shd w:fill="EAF2F8"/>
-          </w:tcPr>
-          <w:p>
-            <w:pPr>
-              <w:spacing w:after="0" w:line="252" w:lineRule="auto"/>
-            </w:pPr>
-            <w:r>
-              <w:rPr>
-                <w:rFonts w:ascii="Arial" w:hAnsi="Arial"/>
-                <w:b w:val="0"/>
-                <w:color w:val="000000"/>
-                <w:sz w:val="19"/>
-              </w:rPr>
-              <w:t>Type</w:t>
-            </w:r>
-          </w:p>
-        </w:tc>
-        <w:tc>
-          <w:tcPr>
-            <w:tcW w:type="dxa" w:w="3672"/>
-            <w:vAlign w:val="center"/>
-            <w:tcMar>
-              <w:top w:w="120" w:type="dxa"/>
-              <w:start w:w="130" w:type="dxa"/>
-              <w:bottom w:w="120" w:type="dxa"/>
-              <w:end w:w="130" w:type="dxa"/>
-            </w:tcMar>
-            <w:shd w:fill="EAF2F8"/>
-          </w:tcPr>
-          <w:p>
-            <w:pPr>
-              <w:spacing w:after="0" w:line="252" w:lineRule="auto"/>
-            </w:pPr>
-            <w:r>
-              <w:rPr>
-                <w:rFonts w:ascii="Arial" w:hAnsi="Arial"/>
-                <w:b w:val="0"/>
-                <w:color w:val="000000"/>
-                <w:sz w:val="19"/>
-              </w:rPr>
-              <w:t>PASSENGER</w:t>
-            </w:r>
-          </w:p>
-        </w:tc>
-        <w:tc>
-          <w:tcPr>
-            <w:tcW w:type="dxa" w:w="3672"/>
-            <w:vAlign w:val="center"/>
-            <w:tcMar>
-              <w:top w:w="120" w:type="dxa"/>
-              <w:start w:w="130" w:type="dxa"/>
-              <w:bottom w:w="120" w:type="dxa"/>
-              <w:end w:w="130" w:type="dxa"/>
-            </w:tcMar>
-            <w:shd w:fill="EAF2F8"/>
-          </w:tcPr>
-          <w:p>
-            <w:pPr>
-              <w:spacing w:after="0" w:line="252" w:lineRule="auto"/>
-            </w:pPr>
-            <w:r>
-              <w:rPr>
-                <w:rFonts w:ascii="Arial" w:hAnsi="Arial"/>
-                <w:b w:val="0"/>
-                <w:color w:val="000000"/>
-                <w:sz w:val="19"/>
-              </w:rPr>
-              <w:t>SPORTS</w:t>
-            </w:r>
-          </w:p>
-        </w:tc>
-      </w:tr>
-      <w:tr>
-        <w:tc>
-          <w:tcPr>
-            <w:tcW w:type="dxa" w:w="2376"/>
-            <w:vAlign w:val="center"/>
-            <w:tcMar>
-              <w:top w:w="120" w:type="dxa"/>
-              <w:start w:w="130" w:type="dxa"/>
-              <w:bottom w:w="120" w:type="dxa"/>
-              <w:end w:w="130" w:type="dxa"/>
-            </w:tcMar>
-          </w:tcPr>
-          <w:p>
-            <w:pPr>
-              <w:spacing w:after="0" w:line="252" w:lineRule="auto"/>
-            </w:pPr>
-            <w:r>
-              <w:rPr>
-                <w:rFonts w:ascii="Arial" w:hAnsi="Arial"/>
-                <w:b w:val="0"/>
-                <w:color w:val="000000"/>
-                <w:sz w:val="19"/>
-              </w:rPr>
-              <w:t>Seat rule</w:t>
-            </w:r>
-          </w:p>
-        </w:tc>
-        <w:tc>
-          <w:tcPr>
-            <w:tcW w:type="dxa" w:w="3672"/>
-            <w:vAlign w:val="center"/>
-            <w:tcMar>
-              <w:top w:w="120" w:type="dxa"/>
-              <w:start w:w="130" w:type="dxa"/>
-              <w:bottom w:w="120" w:type="dxa"/>
-              <w:end w:w="130" w:type="dxa"/>
-            </w:tcMar>
-          </w:tcPr>
-          <w:p>
-            <w:pPr>
-              <w:spacing w:after="0" w:line="252" w:lineRule="auto"/>
-            </w:pPr>
-            <w:r>
-              <w:rPr>
-                <w:rFonts w:ascii="Arial" w:hAnsi="Arial"/>
-                <w:b w:val="0"/>
-                <w:color w:val="000000"/>
-                <w:sz w:val="19"/>
-              </w:rPr>
-              <w:t>Four to seven seats</w:t>
-            </w:r>
-          </w:p>
-        </w:tc>
-        <w:tc>
-          <w:tcPr>
-            <w:tcW w:type="dxa" w:w="3672"/>
-            <w:vAlign w:val="center"/>
-            <w:tcMar>
-              <w:top w:w="120" w:type="dxa"/>
-              <w:start w:w="130" w:type="dxa"/>
-              <w:bottom w:w="120" w:type="dxa"/>
-              <w:end w:w="130" w:type="dxa"/>
-            </w:tcMar>
-          </w:tcPr>
-          <w:p>
-            <w:pPr>
-              <w:spacing w:after="0" w:line="252" w:lineRule="auto"/>
-            </w:pPr>
-            <w:r>
-              <w:rPr>
-                <w:rFonts w:ascii="Arial" w:hAnsi="Arial"/>
-                <w:b w:val="0"/>
-                <w:color w:val="000000"/>
-                <w:sz w:val="19"/>
-              </w:rPr>
-              <w:t>At most two seats</w:t>
-            </w:r>
-          </w:p>
-        </w:tc>
-      </w:tr>
-      <w:tr>
-        <w:tc>
-          <w:tcPr>
-            <w:tcW w:type="dxa" w:w="2376"/>
-            <w:vAlign w:val="center"/>
-            <w:tcMar>
-              <w:top w:w="120" w:type="dxa"/>
-              <w:start w:w="130" w:type="dxa"/>
-              <w:bottom w:w="120" w:type="dxa"/>
-              <w:end w:w="130" w:type="dxa"/>
-            </w:tcMar>
-            <w:shd w:fill="EAF2F8"/>
-          </w:tcPr>
-          <w:p>
-            <w:pPr>
-              <w:spacing w:after="0" w:line="252" w:lineRule="auto"/>
-            </w:pPr>
-            <w:r>
-              <w:rPr>
-                <w:rFonts w:ascii="Arial" w:hAnsi="Arial"/>
-                <w:b w:val="0"/>
-                <w:color w:val="000000"/>
-                <w:sz w:val="19"/>
-              </w:rPr>
-              <w:t>Power rule</w:t>
-            </w:r>
-          </w:p>
-        </w:tc>
-        <w:tc>
-          <w:tcPr>
-            <w:tcW w:type="dxa" w:w="3672"/>
-            <w:vAlign w:val="center"/>
-            <w:tcMar>
-              <w:top w:w="120" w:type="dxa"/>
-              <w:start w:w="130" w:type="dxa"/>
-              <w:bottom w:w="120" w:type="dxa"/>
-              <w:end w:w="130" w:type="dxa"/>
-            </w:tcMar>
-            <w:shd w:fill="EAF2F8"/>
-          </w:tcPr>
-          <w:p>
-            <w:pPr>
-              <w:spacing w:after="0" w:line="252" w:lineRule="auto"/>
-            </w:pPr>
-            <w:r>
-              <w:rPr>
-                <w:rFonts w:ascii="Arial" w:hAnsi="Arial"/>
-                <w:b w:val="0"/>
-                <w:color w:val="000000"/>
-                <w:sz w:val="19"/>
-              </w:rPr>
-              <w:t>Any positive horsepower</w:t>
-            </w:r>
-          </w:p>
-        </w:tc>
-        <w:tc>
-          <w:tcPr>
-            <w:tcW w:type="dxa" w:w="3672"/>
-            <w:vAlign w:val="center"/>
-            <w:tcMar>
-              <w:top w:w="120" w:type="dxa"/>
-              <w:start w:w="130" w:type="dxa"/>
-              <w:bottom w:w="120" w:type="dxa"/>
-              <w:end w:w="130" w:type="dxa"/>
-            </w:tcMar>
-            <w:shd w:fill="EAF2F8"/>
-          </w:tcPr>
-          <w:p>
-            <w:pPr>
-              <w:spacing w:after="0" w:line="252" w:lineRule="auto"/>
-            </w:pPr>
-            <w:r>
-              <w:rPr>
-                <w:rFonts w:ascii="Arial" w:hAnsi="Arial"/>
-                <w:b w:val="0"/>
-                <w:color w:val="000000"/>
-                <w:sz w:val="19"/>
-              </w:rPr>
-              <w:t>At least 300 horsepower</w:t>
-            </w:r>
-          </w:p>
-        </w:tc>
-      </w:tr>
-      <w:tr>
-        <w:tc>
-          <w:tcPr>
-            <w:tcW w:type="dxa" w:w="2376"/>
-            <w:vAlign w:val="center"/>
-            <w:tcMar>
-              <w:top w:w="120" w:type="dxa"/>
-              <w:start w:w="130" w:type="dxa"/>
-              <w:bottom w:w="120" w:type="dxa"/>
-              <w:end w:w="130" w:type="dxa"/>
-            </w:tcMar>
-          </w:tcPr>
-          <w:p>
-            <w:pPr>
-              <w:spacing w:after="0" w:line="252" w:lineRule="auto"/>
-            </w:pPr>
-            <w:r>
-              <w:rPr>
-                <w:rFonts w:ascii="Arial" w:hAnsi="Arial"/>
-                <w:b w:val="0"/>
-                <w:color w:val="000000"/>
-                <w:sz w:val="19"/>
-              </w:rPr>
-              <w:t>Transmission rule</w:t>
-            </w:r>
-          </w:p>
-        </w:tc>
-        <w:tc>
-          <w:tcPr>
-            <w:tcW w:type="dxa" w:w="3672"/>
-            <w:vAlign w:val="center"/>
-            <w:tcMar>
-              <w:top w:w="120" w:type="dxa"/>
-              <w:start w:w="130" w:type="dxa"/>
-              <w:bottom w:w="120" w:type="dxa"/>
-              <w:end w:w="130" w:type="dxa"/>
-            </w:tcMar>
-          </w:tcPr>
-          <w:p>
-            <w:pPr>
-              <w:spacing w:after="0" w:line="252" w:lineRule="auto"/>
-            </w:pPr>
-            <w:r>
-              <w:rPr>
-                <w:rFonts w:ascii="Arial" w:hAnsi="Arial"/>
-                <w:b w:val="0"/>
-                <w:color w:val="000000"/>
-                <w:sz w:val="19"/>
-              </w:rPr>
-              <w:t>Any supported transmission</w:t>
-            </w:r>
-          </w:p>
-        </w:tc>
-        <w:tc>
-          <w:tcPr>
-            <w:tcW w:type="dxa" w:w="3672"/>
-            <w:vAlign w:val="center"/>
-            <w:tcMar>
-              <w:top w:w="120" w:type="dxa"/>
-              <w:start w:w="130" w:type="dxa"/>
-              <w:bottom w:w="120" w:type="dxa"/>
-              <w:end w:w="130" w:type="dxa"/>
-            </w:tcMar>
-          </w:tcPr>
-          <w:p>
-            <w:pPr>
-              <w:spacing w:after="0" w:line="252" w:lineRule="auto"/>
-            </w:pPr>
-            <w:r>
-              <w:rPr>
-                <w:rFonts w:ascii="Arial" w:hAnsi="Arial"/>
-                <w:b w:val="0"/>
-                <w:color w:val="000000"/>
-                <w:sz w:val="19"/>
-              </w:rPr>
-              <w:t>Manual or dual clutch</w:t>
-            </w:r>
-          </w:p>
-        </w:tc>
-      </w:tr>
-      <w:tr>
-        <w:tc>
-          <w:tcPr>
-            <w:tcW w:type="dxa" w:w="2376"/>
-            <w:vAlign w:val="center"/>
-            <w:tcMar>
-              <w:top w:w="120" w:type="dxa"/>
-              <w:start w:w="130" w:type="dxa"/>
-              <w:bottom w:w="120" w:type="dxa"/>
-              <w:end w:w="130" w:type="dxa"/>
-            </w:tcMar>
-            <w:shd w:fill="EAF2F8"/>
-          </w:tcPr>
-          <w:p>
-            <w:pPr>
-              <w:spacing w:after="0" w:line="252" w:lineRule="auto"/>
-            </w:pPr>
-            <w:r>
-              <w:rPr>
-                <w:rFonts w:ascii="Arial" w:hAnsi="Arial"/>
-                <w:b w:val="0"/>
-                <w:color w:val="000000"/>
-                <w:sz w:val="19"/>
-              </w:rPr>
-              <w:t>Director example</w:t>
-            </w:r>
-          </w:p>
-        </w:tc>
-        <w:tc>
-          <w:tcPr>
-            <w:tcW w:type="dxa" w:w="3672"/>
-            <w:vAlign w:val="center"/>
-            <w:tcMar>
-              <w:top w:w="120" w:type="dxa"/>
-              <w:start w:w="130" w:type="dxa"/>
-              <w:bottom w:w="120" w:type="dxa"/>
-              <w:end w:w="130" w:type="dxa"/>
-            </w:tcMar>
-            <w:shd w:fill="EAF2F8"/>
-          </w:tcPr>
-          <w:p>
-            <w:pPr>
-              <w:spacing w:after="0" w:line="252" w:lineRule="auto"/>
-            </w:pPr>
-            <w:r>
-              <w:rPr>
-                <w:rFonts w:ascii="Arial" w:hAnsi="Arial"/>
-                <w:b w:val="0"/>
-                <w:color w:val="000000"/>
-                <w:sz w:val="19"/>
-              </w:rPr>
-              <w:t>AITU Family One</w:t>
-            </w:r>
-          </w:p>
-        </w:tc>
-        <w:tc>
-          <w:tcPr>
-            <w:tcW w:type="dxa" w:w="3672"/>
-            <w:vAlign w:val="center"/>
-            <w:tcMar>
-              <w:top w:w="120" w:type="dxa"/>
-              <w:start w:w="130" w:type="dxa"/>
-              <w:bottom w:w="120" w:type="dxa"/>
-              <w:end w:w="130" w:type="dxa"/>
-            </w:tcMar>
-            <w:shd w:fill="EAF2F8"/>
-          </w:tcPr>
-          <w:p>
-            <w:pPr>
-              <w:spacing w:after="0" w:line="252" w:lineRule="auto"/>
-            </w:pPr>
-            <w:r>
-              <w:rPr>
-                <w:rFonts w:ascii="Arial" w:hAnsi="Arial"/>
-                <w:b w:val="0"/>
-                <w:color w:val="000000"/>
-                <w:sz w:val="19"/>
-              </w:rPr>
-              <w:t>AITU Velocity</w:t>
-            </w:r>
-          </w:p>
-        </w:tc>
-      </w:tr>
-    </w:tbl>
-    <w:p>
-      <w:pPr>
-        <w:spacing w:after="0"/>
-      </w:pPr>
     </w:p>
     <w:p>
       <w:pPr>
-        <w:pStyle w:val="Heading2"/>
-        <w:keepNext/>
+        <w:spacing w:line="276" w:lineRule="auto" w:after="120"/>
+        <w:ind w:firstLine="576"/>
+        <w:jc w:val="both"/>
       </w:pPr>
       <w:r>
-        <w:t>Fluent Construction Example</w:t>
-      </w:r>
-    </w:p>
-    <w:p>
-      <w:r>
-        <w:t>The following client code builds a custom electric passenger car without using the Director. The method names expose the intent of each value, and the final build() call marks the point where validation and object creation occur.</w:t>
+        <w:rPr>
+          <w:rFonts w:ascii="Times New Roman" w:hAnsi="Times New Roman"/>
+          <w:b w:val="0"/>
+          <w:i w:val="0"/>
+          <w:color w:val="000000"/>
+          <w:sz w:val="24"/>
+        </w:rPr>
+        <w:t>The class and method names describe their purpose. For example, buildFamilyCar clearly says what kind of object will be created. A name such as build1 would not explain the method.</w:t>
       </w:r>
     </w:p>
     <w:p>
       <w:pPr>
         <w:keepLines/>
-        <w:spacing w:before="60" w:after="140" w:line="240" w:lineRule="auto"/>
-        <w:ind w:left="432" w:right="216"/>
+        <w:spacing w:before="60" w:after="160" w:line="240" w:lineRule="auto"/>
+        <w:ind w:left="648"/>
       </w:pPr>
       <w:r>
         <w:rPr>
-          <w:rFonts w:ascii="Liberation Mono" w:hAnsi="Liberation Mono"/>
+          <w:rFonts w:ascii="Courier New" w:hAnsi="Courier New"/>
+          <w:b w:val="0"/>
+          <w:i w:val="0"/>
           <w:color w:val="000000"/>
-          <w:sz w:val="17"/>
+          <w:sz w:val="19"/>
         </w:rPr>
-        <w:t>Car customPassengerCar = new PassengerCarBuilder()</w:t>
+        <w:t>Car familyCar = director.buildFamilyCar(new PassengerCarBuilder());</w:t>
         <w:br/>
-        <w:t xml:space="preserve">        .setModel("AITU Eco Custom")</w:t>
-        <w:br/>
-        <w:t xml:space="preserve">        .setEngine(new Engine("Electric Drive", 220, FuelType.ELECTRIC))</w:t>
-        <w:br/>
-        <w:t xml:space="preserve">        .setSeats(5)</w:t>
-        <w:br/>
-        <w:t xml:space="preserve">        .setTransmission(Transmission.AUTOMATIC)</w:t>
-        <w:br/>
-        <w:t xml:space="preserve">        .setColor("Pearl White")</w:t>
-        <w:br/>
-        <w:t xml:space="preserve">        .addFeature("Fast charging")</w:t>
-        <w:br/>
-        <w:t xml:space="preserve">        .addFeature("Heated seats")</w:t>
-        <w:br/>
-        <w:t xml:space="preserve">        .build();</w:t>
-      </w:r>
-    </w:p>
-    <w:p>
-      <w:pPr>
-        <w:pStyle w:val="Heading1"/>
-        <w:keepNext/>
-      </w:pPr>
-      <w:r>
-        <w:t>4 Clean Code Principles</w:t>
-      </w:r>
-    </w:p>
-    <w:p>
-      <w:r>
-        <w:t>The implementation applies the following seven Clean Code principles. Each subsection uses an excerpt from the submitted source code and explains the specific improvement it provides.</w:t>
+        <w:t>Car sportsCar = director.buildSportsCar(new SportsCarBuilder());</w:t>
       </w:r>
     </w:p>
     <w:p>
       <w:pPr>
         <w:pStyle w:val="Heading2"/>
         <w:keepNext/>
+        <w:spacing w:before="160" w:after="100"/>
       </w:pPr>
       <w:r>
-        <w:t>4 1 Meaningful Names</w:t>
+        <w:t>4 2 Small Classes and Methods</w:t>
       </w:r>
     </w:p>
     <w:p>
+      <w:pPr>
+        <w:spacing w:line="276" w:lineRule="auto" w:after="120"/>
+        <w:ind w:firstLine="576"/>
+        <w:jc w:val="both"/>
+      </w:pPr>
       <w:r>
-        <w:t>Names state the purpose of each object and operation. constructFamilyCar communicates a complete reusable recipe, while familyCar and sportsCar identify the resulting values. A name such as create() or object1 would hide this intent.</w:t>
+        <w:rPr>
+          <w:rFonts w:ascii="Times New Roman" w:hAnsi="Times New Roman"/>
+          <w:b w:val="0"/>
+          <w:i w:val="0"/>
+          <w:color w:val="000000"/>
+          <w:sz w:val="24"/>
+        </w:rPr>
+        <w:t>Each class has one main responsibility. Car stores the final data, CarDirector contains the construction sequences, and the concrete builders contain their own rules. The following method only checks the passenger car seat rule.</w:t>
       </w:r>
     </w:p>
     <w:p>
       <w:pPr>
         <w:keepLines/>
-        <w:spacing w:before="60" w:after="140" w:line="240" w:lineRule="auto"/>
-        <w:ind w:left="432" w:right="216"/>
+        <w:spacing w:before="60" w:after="160" w:line="240" w:lineRule="auto"/>
+        <w:ind w:left="648"/>
       </w:pPr>
       <w:r>
         <w:rPr>
-          <w:rFonts w:ascii="Liberation Mono" w:hAnsi="Liberation Mono"/>
+          <w:rFonts w:ascii="Courier New" w:hAnsi="Courier New"/>
+          <w:b w:val="0"/>
+          <w:i w:val="0"/>
           <w:color w:val="000000"/>
-          <w:sz w:val="17"/>
+          <w:sz w:val="19"/>
         </w:rPr>
-        <w:t>Car familyCar = director.constructFamilyCar(new PassengerCarBuilder());</w:t>
+        <w:t>protected void validateSpecificRules() {</w:t>
         <w:br/>
-        <w:t>Car sportsCar = director.constructSportsCar(new SportsCarBuilder());</w:t>
-      </w:r>
-    </w:p>
-    <w:p>
-      <w:pPr>
-        <w:pStyle w:val="Heading2"/>
-        <w:keepNext/>
-      </w:pPr>
-      <w:r>
-        <w:t>4 2 Small Focused Classes and Methods</w:t>
-      </w:r>
-    </w:p>
-    <w:p>
-      <w:r>
-        <w:t>Each concrete builder contains only the rules unique to its representation. The passenger builder does not print output, construct predefined recipes, or validate sports cars. This keeps the class focused on one reason to change.</w:t>
-      </w:r>
-    </w:p>
-    <w:p>
-      <w:pPr>
-        <w:keepLines/>
-        <w:spacing w:before="60" w:after="140" w:line="240" w:lineRule="auto"/>
-        <w:ind w:left="432" w:right="216"/>
-      </w:pPr>
-      <w:r>
-        <w:rPr>
-          <w:rFonts w:ascii="Liberation Mono" w:hAnsi="Liberation Mono"/>
-          <w:color w:val="000000"/>
-          <w:sz w:val="17"/>
-        </w:rPr>
-        <w:t>@Override</w:t>
-        <w:br/>
-        <w:t>protected void validateSpecificState() {</w:t>
-        <w:br/>
-        <w:t xml:space="preserve">    if (seats &lt; MINIMUM_PASSENGER_SEATS || seats &gt; MAXIMUM_PASSENGER_SEATS) {</w:t>
+        <w:t xml:space="preserve">    if (seats &lt; MIN_SEATS || seats &gt; MAX_SEATS) {</w:t>
         <w:br/>
         <w:t xml:space="preserve">        throw new IllegalStateException(</w:t>
         <w:br/>
-        <w:t xml:space="preserve">                "Passenger car seat count must be between "</w:t>
-        <w:br/>
-        <w:t xml:space="preserve">                        + MINIMUM_PASSENGER_SEATS + " and "</w:t>
-        <w:br/>
-        <w:t xml:space="preserve">                        + MAXIMUM_PASSENGER_SEATS</w:t>
-        <w:br/>
-        <w:t xml:space="preserve">        );</w:t>
+        <w:t xml:space="preserve">                "A passenger car must have 4 to 7 seats");</w:t>
         <w:br/>
         <w:t xml:space="preserve">    }</w:t>
         <w:br/>
@@ -1793,81 +471,48 @@
       <w:pPr>
         <w:pStyle w:val="Heading2"/>
         <w:keepNext/>
+        <w:spacing w:before="160" w:after="100"/>
       </w:pPr>
       <w:r>
-        <w:t>4 3 No Duplicated Construction Logic</w:t>
+        <w:t>4 3 No Duplicated Builder Methods</w:t>
       </w:r>
     </w:p>
     <w:p>
+      <w:pPr>
+        <w:spacing w:line="276" w:lineRule="auto" w:after="120"/>
+        <w:ind w:firstLine="576"/>
+        <w:jc w:val="both"/>
+      </w:pPr>
       <w:r>
-        <w:t>AbstractCarBuilder implements the fluent setters and the common build sequence once. Both concrete builders inherit this behavior and supply only validateSpecificState(). Without the abstract class, the same fields, setters, reset code, and common validation would appear in both concrete builders.</w:t>
+        <w:rPr>
+          <w:rFonts w:ascii="Times New Roman" w:hAnsi="Times New Roman"/>
+          <w:b w:val="0"/>
+          <w:i w:val="0"/>
+          <w:color w:val="000000"/>
+          <w:sz w:val="24"/>
+        </w:rPr>
+        <w:t>The common setter methods are written once in CarBuilder. The concrete builders inherit them, so PassengerCarBuilder and SportsCarBuilder do not repeat the same code.</w:t>
       </w:r>
     </w:p>
     <w:p>
       <w:pPr>
         <w:keepLines/>
-        <w:spacing w:before="60" w:after="140" w:line="240" w:lineRule="auto"/>
-        <w:ind w:left="432" w:right="216"/>
+        <w:spacing w:before="60" w:after="160" w:line="240" w:lineRule="auto"/>
+        <w:ind w:left="648"/>
       </w:pPr>
       <w:r>
         <w:rPr>
-          <w:rFonts w:ascii="Liberation Mono" w:hAnsi="Liberation Mono"/>
+          <w:rFonts w:ascii="Courier New" w:hAnsi="Courier New"/>
+          <w:b w:val="0"/>
+          <w:i w:val="0"/>
           <w:color w:val="000000"/>
-          <w:sz w:val="17"/>
+          <w:sz w:val="19"/>
         </w:rPr>
-        <w:t>@Override</w:t>
-        <w:br/>
-        <w:t>public final CarBuilder setSeats(int seats) {</w:t>
+        <w:t>public CarBuilder setSeats(int seats) {</w:t>
         <w:br/>
         <w:t xml:space="preserve">    this.seats = seats;</w:t>
         <w:br/>
         <w:t xml:space="preserve">    return this;</w:t>
-        <w:br/>
-        <w:t>}</w:t>
-        <w:br/>
-        <w:br/>
-        <w:t>protected abstract void validateSpecificState();</w:t>
-      </w:r>
-    </w:p>
-    <w:p>
-      <w:pPr>
-        <w:pStyle w:val="Heading2"/>
-        <w:keepNext/>
-      </w:pPr>
-      <w:r>
-        <w:t>4 4 Validated Construction</w:t>
-      </w:r>
-    </w:p>
-    <w:p>
-      <w:r>
-        <w:t>build() refuses to create an incomplete or invalid product. The exception tells the client which required value is missing. Common validation runs before representation-specific rules, so every returned Car satisfies both levels of constraints.</w:t>
-      </w:r>
-    </w:p>
-    <w:p>
-      <w:pPr>
-        <w:keepLines/>
-        <w:spacing w:before="60" w:after="140" w:line="240" w:lineRule="auto"/>
-        <w:ind w:left="432" w:right="216"/>
-      </w:pPr>
-      <w:r>
-        <w:rPr>
-          <w:rFonts w:ascii="Liberation Mono" w:hAnsi="Liberation Mono"/>
-          <w:color w:val="000000"/>
-          <w:sz w:val="17"/>
-        </w:rPr>
-        <w:t>if (engine == null) {</w:t>
-        <w:br/>
-        <w:t xml:space="preserve">    throw new IllegalStateException(</w:t>
-        <w:br/>
-        <w:t xml:space="preserve">            "Car engine must be provided before build()");</w:t>
-        <w:br/>
-        <w:t>}</w:t>
-        <w:br/>
-        <w:t>if (transmission == null) {</w:t>
-        <w:br/>
-        <w:t xml:space="preserve">    throw new IllegalStateException(</w:t>
-        <w:br/>
-        <w:t xml:space="preserve">            "Car transmission must be provided before build()");</w:t>
         <w:br/>
         <w:t>}</w:t>
       </w:r>
@@ -1876,42 +521,52 @@
       <w:pPr>
         <w:pStyle w:val="Heading2"/>
         <w:keepNext/>
+        <w:spacing w:before="160" w:after="100"/>
       </w:pPr>
       <w:r>
-        <w:t>4 5 No Magic Numbers</w:t>
+        <w:t>4 4 Validation</w:t>
       </w:r>
     </w:p>
     <w:p>
+      <w:pPr>
+        <w:spacing w:line="276" w:lineRule="auto" w:after="120"/>
+        <w:ind w:firstLine="576"/>
+        <w:jc w:val="both"/>
+      </w:pPr>
       <w:r>
-        <w:t>Named constants explain why numeric limits exist. The comparison reads as a business rule, and a future change to the minimum power requirement has one clear location.</w:t>
+        <w:rPr>
+          <w:rFonts w:ascii="Times New Roman" w:hAnsi="Times New Roman"/>
+          <w:b w:val="0"/>
+          <w:i w:val="0"/>
+          <w:color w:val="000000"/>
+          <w:sz w:val="24"/>
+        </w:rPr>
+        <w:t>The build method checks the data before creating a Car. If an important value is missing, the program gives a clear exception instead of creating an incorrect object.</w:t>
       </w:r>
     </w:p>
     <w:p>
       <w:pPr>
         <w:keepLines/>
-        <w:spacing w:before="60" w:after="140" w:line="240" w:lineRule="auto"/>
-        <w:ind w:left="432" w:right="216"/>
+        <w:spacing w:before="60" w:after="160" w:line="240" w:lineRule="auto"/>
+        <w:ind w:left="648"/>
       </w:pPr>
       <w:r>
         <w:rPr>
-          <w:rFonts w:ascii="Liberation Mono" w:hAnsi="Liberation Mono"/>
+          <w:rFonts w:ascii="Courier New" w:hAnsi="Courier New"/>
+          <w:b w:val="0"/>
+          <w:i w:val="0"/>
           <w:color w:val="000000"/>
-          <w:sz w:val="17"/>
+          <w:sz w:val="19"/>
         </w:rPr>
-        <w:t>private static final int MAXIMUM_SPORTS_SEATS = 2;</w:t>
+        <w:t>if (model == null || model.isBlank()) {</w:t>
         <w:br/>
-        <w:t>private static final int MINIMUM_SPORTS_HORSEPOWER = 300;</w:t>
+        <w:t xml:space="preserve">    throw new IllegalStateException("Model is required");</w:t>
         <w:br/>
+        <w:t>}</w:t>
         <w:br/>
-        <w:t>if (engine.horsepower() &lt; MINIMUM_SPORTS_HORSEPOWER) {</w:t>
+        <w:t>if (engine == null || engine.isBlank()) {</w:t>
         <w:br/>
-        <w:t xml:space="preserve">    throw new IllegalStateException(</w:t>
-        <w:br/>
-        <w:t xml:space="preserve">            "Sports car engine must produce at least "</w:t>
-        <w:br/>
-        <w:t xml:space="preserve">                    + MINIMUM_SPORTS_HORSEPOWER + " hp"</w:t>
-        <w:br/>
-        <w:t xml:space="preserve">    );</w:t>
+        <w:t xml:space="preserve">    throw new IllegalStateException("Engine is required");</w:t>
         <w:br/>
         <w:t>}</w:t>
       </w:r>
@@ -1920,668 +575,121 @@
       <w:pPr>
         <w:pStyle w:val="Heading2"/>
         <w:keepNext/>
+        <w:spacing w:before="160" w:after="100"/>
       </w:pPr>
       <w:r>
-        <w:t>4 6 Immutable Finished Product</w:t>
+        <w:t>4 5 No Magic Numbers</w:t>
       </w:r>
     </w:p>
     <w:p>
+      <w:pPr>
+        <w:spacing w:line="276" w:lineRule="auto" w:after="120"/>
+        <w:ind w:firstLine="576"/>
+        <w:jc w:val="both"/>
+      </w:pPr>
       <w:r>
-        <w:t>Car fields are final and the constructor copies the feature collection. Client code cannot change the completed product by retaining or modifying the builder's original list. This separates mutable construction state from the stable result.</w:t>
+        <w:rPr>
+          <w:rFonts w:ascii="Times New Roman" w:hAnsi="Times New Roman"/>
+          <w:b w:val="0"/>
+          <w:i w:val="0"/>
+          <w:color w:val="000000"/>
+          <w:sz w:val="24"/>
+        </w:rPr>
+        <w:t>The sports car limits are stored in named constants. The constants make the meaning of 2 and 300 clear and make the values easier to change later.</w:t>
       </w:r>
     </w:p>
     <w:p>
       <w:pPr>
         <w:keepLines/>
-        <w:spacing w:before="60" w:after="140" w:line="240" w:lineRule="auto"/>
-        <w:ind w:left="432" w:right="216"/>
+        <w:spacing w:before="60" w:after="160" w:line="240" w:lineRule="auto"/>
+        <w:ind w:left="648"/>
       </w:pPr>
       <w:r>
         <w:rPr>
-          <w:rFonts w:ascii="Liberation Mono" w:hAnsi="Liberation Mono"/>
+          <w:rFonts w:ascii="Courier New" w:hAnsi="Courier New"/>
+          <w:b w:val="0"/>
+          <w:i w:val="0"/>
           <w:color w:val="000000"/>
-          <w:sz w:val="17"/>
+          <w:sz w:val="19"/>
         </w:rPr>
-        <w:t>private final Engine engine;</w:t>
+        <w:t>private static final int MAX_SEATS = 2;</w:t>
         <w:br/>
-        <w:t>private final List&lt;String&gt; features;</w:t>
-        <w:br/>
-        <w:br/>
-        <w:t>this.engine = Objects.requireNonNull(engine);</w:t>
-        <w:br/>
-        <w:t>this.features = List.copyOf(features);</w:t>
-      </w:r>
-    </w:p>
-    <w:p>
-      <w:pPr>
-        <w:pStyle w:val="Heading2"/>
-        <w:keepNext/>
-      </w:pPr>
-      <w:r>
-        <w:t>4 7 Minimal Purposeful Comments</w:t>
-      </w:r>
-    </w:p>
-    <w:p>
-      <w:r>
-        <w:t>Comments describe design intent that is not fully visible from the syntax. The class comment explains why the abstract builder exists, while readable method names and small methods avoid line-by-line comments that would repeat the code.</w:t>
-      </w:r>
-    </w:p>
-    <w:p>
-      <w:pPr>
-        <w:keepLines/>
-        <w:spacing w:before="60" w:after="140" w:line="240" w:lineRule="auto"/>
-        <w:ind w:left="432" w:right="216"/>
-      </w:pPr>
-      <w:r>
-        <w:rPr>
-          <w:rFonts w:ascii="Liberation Mono" w:hAnsi="Liberation Mono"/>
-          <w:color w:val="000000"/>
-          <w:sz w:val="17"/>
-        </w:rPr>
-        <w:t>/**</w:t>
-        <w:br/>
-        <w:t xml:space="preserve"> * Holds construction state and shared build logic so concrete builders do not</w:t>
-        <w:br/>
-        <w:t xml:space="preserve"> * duplicate fluent setters or common validation.</w:t>
-        <w:br/>
-        <w:t xml:space="preserve"> */</w:t>
-        <w:br/>
-        <w:t>public abstract class AbstractCarBuilder implements CarBuilder {</w:t>
+        <w:t>private static final int MIN_HORSEPOWER = 300;</w:t>
       </w:r>
     </w:p>
     <w:p>
       <w:pPr>
         <w:pStyle w:val="Heading1"/>
         <w:keepNext/>
+        <w:spacing w:before="240" w:after="100"/>
       </w:pPr>
       <w:r>
-        <w:t>5 Demonstration and Verification</w:t>
-      </w:r>
-    </w:p>
-    <w:p>
-      <w:r>
-        <w:t>The Main client demonstrates three paths: a family car constructed by the Director, a sports car constructed by the Director, and a custom electric car constructed directly through the fluent API. The helper scripts use javac with the Java 17 release target, so no external Java dependency is required.</w:t>
+        <w:t>5 Conclusion</w:t>
       </w:r>
     </w:p>
     <w:p>
       <w:pPr>
-        <w:keepLines/>
-        <w:spacing w:before="60" w:after="140" w:line="240" w:lineRule="auto"/>
-        <w:ind w:left="432" w:right="216"/>
+        <w:spacing w:line="276" w:lineRule="auto" w:after="120"/>
+        <w:ind w:firstLine="576"/>
+        <w:jc w:val="both"/>
       </w:pPr>
       <w:r>
         <w:rPr>
-          <w:rFonts w:ascii="Liberation Mono" w:hAnsi="Liberation Mono"/>
+          <w:rFonts w:ascii="Times New Roman" w:hAnsi="Times New Roman"/>
+          <w:b w:val="0"/>
+          <w:i w:val="0"/>
           <w:color w:val="000000"/>
-          <w:sz w:val="17"/>
+          <w:sz w:val="24"/>
         </w:rPr>
-        <w:t>./scripts/run.sh</w:t>
-        <w:br/>
-        <w:t>./scripts/test.sh</w:t>
+        <w:t>During this assignment, I found that the main advantage of Builder is readability. The named methods make it clear which value is being set, and optional features can be added without creating many constructors. The Director is also useful because it keeps common car configurations in one place.</w:t>
       </w:r>
     </w:p>
-    <w:tbl>
-      <w:tblPr>
-        <w:tblW w:type="auto" w:w="0"/>
-        <w:jc w:val="center"/>
-        <w:tblLayout w:type="fixed"/>
-        <w:tblLook w:firstColumn="1" w:firstRow="1" w:lastColumn="0" w:lastRow="0" w:noHBand="0" w:noVBand="1" w:val="04A0"/>
-        <w:tblBorders>
-          <w:top w:val="single" w:sz="8" w:space="0" w:color="D9D9D9"/>
-          <w:left w:val="single" w:sz="8" w:space="0" w:color="D9D9D9"/>
-          <w:bottom w:val="single" w:sz="8" w:space="0" w:color="D9D9D9"/>
-          <w:right w:val="single" w:sz="8" w:space="0" w:color="D9D9D9"/>
-          <w:insideH w:val="single" w:sz="8" w:space="0" w:color="D9D9D9"/>
-          <w:insideV w:val="single" w:sz="8" w:space="0" w:color="D9D9D9"/>
-        </w:tblBorders>
-      </w:tblPr>
-      <w:tblGrid>
-        <w:gridCol w:w="4997"/>
-        <w:gridCol w:w="4997"/>
-      </w:tblGrid>
-      <w:tr>
-        <w:trPr>
-          <w:tblHeader w:val="true"/>
-        </w:trPr>
-        <w:tc>
-          <w:tcPr>
-            <w:tcW w:type="dxa" w:w="3960"/>
-            <w:vAlign w:val="center"/>
-            <w:tcMar>
-              <w:top w:w="120" w:type="dxa"/>
-              <w:start w:w="130" w:type="dxa"/>
-              <w:bottom w:w="120" w:type="dxa"/>
-              <w:end w:w="130" w:type="dxa"/>
-            </w:tcMar>
-            <w:shd w:fill="1F4E78"/>
-          </w:tcPr>
-          <w:p>
-            <w:pPr>
-              <w:spacing w:after="0" w:line="252" w:lineRule="auto"/>
-            </w:pPr>
-            <w:r>
-              <w:rPr>
-                <w:rFonts w:ascii="Arial" w:hAnsi="Arial"/>
-                <w:b/>
-                <w:color w:val="FFFFFF"/>
-                <w:sz w:val="19"/>
-              </w:rPr>
-              <w:t>Test</w:t>
-            </w:r>
-          </w:p>
-        </w:tc>
-        <w:tc>
-          <w:tcPr>
-            <w:tcW w:type="dxa" w:w="5760"/>
-            <w:vAlign w:val="center"/>
-            <w:tcMar>
-              <w:top w:w="120" w:type="dxa"/>
-              <w:start w:w="130" w:type="dxa"/>
-              <w:bottom w:w="120" w:type="dxa"/>
-              <w:end w:w="130" w:type="dxa"/>
-            </w:tcMar>
-            <w:shd w:fill="1F4E78"/>
-          </w:tcPr>
-          <w:p>
-            <w:pPr>
-              <w:spacing w:after="0" w:line="252" w:lineRule="auto"/>
-            </w:pPr>
-            <w:r>
-              <w:rPr>
-                <w:rFonts w:ascii="Arial" w:hAnsi="Arial"/>
-                <w:b/>
-                <w:color w:val="FFFFFF"/>
-                <w:sz w:val="19"/>
-              </w:rPr>
-              <w:t>Purpose</w:t>
-            </w:r>
-          </w:p>
-        </w:tc>
-      </w:tr>
-      <w:tr>
-        <w:tc>
-          <w:tcPr>
-            <w:tcW w:type="dxa" w:w="3960"/>
-            <w:vAlign w:val="center"/>
-            <w:tcMar>
-              <w:top w:w="120" w:type="dxa"/>
-              <w:start w:w="130" w:type="dxa"/>
-              <w:bottom w:w="120" w:type="dxa"/>
-              <w:end w:w="130" w:type="dxa"/>
-            </w:tcMar>
-          </w:tcPr>
-          <w:p>
-            <w:pPr>
-              <w:spacing w:after="0" w:line="252" w:lineRule="auto"/>
-            </w:pPr>
-            <w:r>
-              <w:rPr>
-                <w:rFonts w:ascii="Arial" w:hAnsi="Arial"/>
-                <w:b w:val="0"/>
-                <w:color w:val="000000"/>
-                <w:sz w:val="19"/>
-              </w:rPr>
-              <w:t>Director builds a passenger car</w:t>
-            </w:r>
-          </w:p>
-        </w:tc>
-        <w:tc>
-          <w:tcPr>
-            <w:tcW w:type="dxa" w:w="5760"/>
-            <w:vAlign w:val="center"/>
-            <w:tcMar>
-              <w:top w:w="120" w:type="dxa"/>
-              <w:start w:w="130" w:type="dxa"/>
-              <w:bottom w:w="120" w:type="dxa"/>
-              <w:end w:w="130" w:type="dxa"/>
-            </w:tcMar>
-          </w:tcPr>
-          <w:p>
-            <w:pPr>
-              <w:spacing w:after="0" w:line="252" w:lineRule="auto"/>
-            </w:pPr>
-            <w:r>
-              <w:rPr>
-                <w:rFonts w:ascii="Arial" w:hAnsi="Arial"/>
-                <w:b w:val="0"/>
-                <w:color w:val="000000"/>
-                <w:sz w:val="19"/>
-              </w:rPr>
-              <w:t>Confirms passenger type, seats, and transmission.</w:t>
-            </w:r>
-          </w:p>
-        </w:tc>
-      </w:tr>
-      <w:tr>
-        <w:tc>
-          <w:tcPr>
-            <w:tcW w:type="dxa" w:w="3960"/>
-            <w:vAlign w:val="center"/>
-            <w:tcMar>
-              <w:top w:w="120" w:type="dxa"/>
-              <w:start w:w="130" w:type="dxa"/>
-              <w:bottom w:w="120" w:type="dxa"/>
-              <w:end w:w="130" w:type="dxa"/>
-            </w:tcMar>
-            <w:shd w:fill="EAF2F8"/>
-          </w:tcPr>
-          <w:p>
-            <w:pPr>
-              <w:spacing w:after="0" w:line="252" w:lineRule="auto"/>
-            </w:pPr>
-            <w:r>
-              <w:rPr>
-                <w:rFonts w:ascii="Arial" w:hAnsi="Arial"/>
-                <w:b w:val="0"/>
-                <w:color w:val="000000"/>
-                <w:sz w:val="19"/>
-              </w:rPr>
-              <w:t>Director builds a sports car</w:t>
-            </w:r>
-          </w:p>
-        </w:tc>
-        <w:tc>
-          <w:tcPr>
-            <w:tcW w:type="dxa" w:w="5760"/>
-            <w:vAlign w:val="center"/>
-            <w:tcMar>
-              <w:top w:w="120" w:type="dxa"/>
-              <w:start w:w="130" w:type="dxa"/>
-              <w:bottom w:w="120" w:type="dxa"/>
-              <w:end w:w="130" w:type="dxa"/>
-            </w:tcMar>
-            <w:shd w:fill="EAF2F8"/>
-          </w:tcPr>
-          <w:p>
-            <w:pPr>
-              <w:spacing w:after="0" w:line="252" w:lineRule="auto"/>
-            </w:pPr>
-            <w:r>
-              <w:rPr>
-                <w:rFonts w:ascii="Arial" w:hAnsi="Arial"/>
-                <w:b w:val="0"/>
-                <w:color w:val="000000"/>
-                <w:sz w:val="19"/>
-              </w:rPr>
-              <w:t>Confirms sports type and the power rule.</w:t>
-            </w:r>
-          </w:p>
-        </w:tc>
-      </w:tr>
-      <w:tr>
-        <w:tc>
-          <w:tcPr>
-            <w:tcW w:type="dxa" w:w="3960"/>
-            <w:vAlign w:val="center"/>
-            <w:tcMar>
-              <w:top w:w="120" w:type="dxa"/>
-              <w:start w:w="130" w:type="dxa"/>
-              <w:bottom w:w="120" w:type="dxa"/>
-              <w:end w:w="130" w:type="dxa"/>
-            </w:tcMar>
-          </w:tcPr>
-          <w:p>
-            <w:pPr>
-              <w:spacing w:after="0" w:line="252" w:lineRule="auto"/>
-            </w:pPr>
-            <w:r>
-              <w:rPr>
-                <w:rFonts w:ascii="Arial" w:hAnsi="Arial"/>
-                <w:b w:val="0"/>
-                <w:color w:val="000000"/>
-                <w:sz w:val="19"/>
-              </w:rPr>
-              <w:t>Product feature list is immutable</w:t>
-            </w:r>
-          </w:p>
-        </w:tc>
-        <w:tc>
-          <w:tcPr>
-            <w:tcW w:type="dxa" w:w="5760"/>
-            <w:vAlign w:val="center"/>
-            <w:tcMar>
-              <w:top w:w="120" w:type="dxa"/>
-              <w:start w:w="130" w:type="dxa"/>
-              <w:bottom w:w="120" w:type="dxa"/>
-              <w:end w:w="130" w:type="dxa"/>
-            </w:tcMar>
-          </w:tcPr>
-          <w:p>
-            <w:pPr>
-              <w:spacing w:after="0" w:line="252" w:lineRule="auto"/>
-            </w:pPr>
-            <w:r>
-              <w:rPr>
-                <w:rFonts w:ascii="Arial" w:hAnsi="Arial"/>
-                <w:b w:val="0"/>
-                <w:color w:val="000000"/>
-                <w:sz w:val="19"/>
-              </w:rPr>
-              <w:t>Confirms the finished product cannot be modified.</w:t>
-            </w:r>
-          </w:p>
-        </w:tc>
-      </w:tr>
-      <w:tr>
-        <w:tc>
-          <w:tcPr>
-            <w:tcW w:type="dxa" w:w="3960"/>
-            <w:vAlign w:val="center"/>
-            <w:tcMar>
-              <w:top w:w="120" w:type="dxa"/>
-              <w:start w:w="130" w:type="dxa"/>
-              <w:bottom w:w="120" w:type="dxa"/>
-              <w:end w:w="130" w:type="dxa"/>
-            </w:tcMar>
-            <w:shd w:fill="EAF2F8"/>
-          </w:tcPr>
-          <w:p>
-            <w:pPr>
-              <w:spacing w:after="0" w:line="252" w:lineRule="auto"/>
-            </w:pPr>
-            <w:r>
-              <w:rPr>
-                <w:rFonts w:ascii="Arial" w:hAnsi="Arial"/>
-                <w:b w:val="0"/>
-                <w:color w:val="000000"/>
-                <w:sz w:val="19"/>
-              </w:rPr>
-              <w:t>Missing required state is rejected</w:t>
-            </w:r>
-          </w:p>
-        </w:tc>
-        <w:tc>
-          <w:tcPr>
-            <w:tcW w:type="dxa" w:w="5760"/>
-            <w:vAlign w:val="center"/>
-            <w:tcMar>
-              <w:top w:w="120" w:type="dxa"/>
-              <w:start w:w="130" w:type="dxa"/>
-              <w:bottom w:w="120" w:type="dxa"/>
-              <w:end w:w="130" w:type="dxa"/>
-            </w:tcMar>
-            <w:shd w:fill="EAF2F8"/>
-          </w:tcPr>
-          <w:p>
-            <w:pPr>
-              <w:spacing w:after="0" w:line="252" w:lineRule="auto"/>
-            </w:pPr>
-            <w:r>
-              <w:rPr>
-                <w:rFonts w:ascii="Arial" w:hAnsi="Arial"/>
-                <w:b w:val="0"/>
-                <w:color w:val="000000"/>
-                <w:sz w:val="19"/>
-              </w:rPr>
-              <w:t>Confirms incomplete products are blocked.</w:t>
-            </w:r>
-          </w:p>
-        </w:tc>
-      </w:tr>
-      <w:tr>
-        <w:tc>
-          <w:tcPr>
-            <w:tcW w:type="dxa" w:w="3960"/>
-            <w:vAlign w:val="center"/>
-            <w:tcMar>
-              <w:top w:w="120" w:type="dxa"/>
-              <w:start w:w="130" w:type="dxa"/>
-              <w:bottom w:w="120" w:type="dxa"/>
-              <w:end w:w="130" w:type="dxa"/>
-            </w:tcMar>
-          </w:tcPr>
-          <w:p>
-            <w:pPr>
-              <w:spacing w:after="0" w:line="252" w:lineRule="auto"/>
-            </w:pPr>
-            <w:r>
-              <w:rPr>
-                <w:rFonts w:ascii="Arial" w:hAnsi="Arial"/>
-                <w:b w:val="0"/>
-                <w:color w:val="000000"/>
-                <w:sz w:val="19"/>
-              </w:rPr>
-              <w:t>Invalid passenger seats are rejected</w:t>
-            </w:r>
-          </w:p>
-        </w:tc>
-        <w:tc>
-          <w:tcPr>
-            <w:tcW w:type="dxa" w:w="5760"/>
-            <w:vAlign w:val="center"/>
-            <w:tcMar>
-              <w:top w:w="120" w:type="dxa"/>
-              <w:start w:w="130" w:type="dxa"/>
-              <w:bottom w:w="120" w:type="dxa"/>
-              <w:end w:w="130" w:type="dxa"/>
-            </w:tcMar>
-          </w:tcPr>
-          <w:p>
-            <w:pPr>
-              <w:spacing w:after="0" w:line="252" w:lineRule="auto"/>
-            </w:pPr>
-            <w:r>
-              <w:rPr>
-                <w:rFonts w:ascii="Arial" w:hAnsi="Arial"/>
-                <w:b w:val="0"/>
-                <w:color w:val="000000"/>
-                <w:sz w:val="19"/>
-              </w:rPr>
-              <w:t>Confirms passenger-specific validation.</w:t>
-            </w:r>
-          </w:p>
-        </w:tc>
-      </w:tr>
-      <w:tr>
-        <w:tc>
-          <w:tcPr>
-            <w:tcW w:type="dxa" w:w="3960"/>
-            <w:vAlign w:val="center"/>
-            <w:tcMar>
-              <w:top w:w="120" w:type="dxa"/>
-              <w:start w:w="130" w:type="dxa"/>
-              <w:bottom w:w="120" w:type="dxa"/>
-              <w:end w:w="130" w:type="dxa"/>
-            </w:tcMar>
-            <w:shd w:fill="EAF2F8"/>
-          </w:tcPr>
-          <w:p>
-            <w:pPr>
-              <w:spacing w:after="0" w:line="252" w:lineRule="auto"/>
-            </w:pPr>
-            <w:r>
-              <w:rPr>
-                <w:rFonts w:ascii="Arial" w:hAnsi="Arial"/>
-                <w:b w:val="0"/>
-                <w:color w:val="000000"/>
-                <w:sz w:val="19"/>
-              </w:rPr>
-              <w:t>Underpowered sports car is rejected</w:t>
-            </w:r>
-          </w:p>
-        </w:tc>
-        <w:tc>
-          <w:tcPr>
-            <w:tcW w:type="dxa" w:w="5760"/>
-            <w:vAlign w:val="center"/>
-            <w:tcMar>
-              <w:top w:w="120" w:type="dxa"/>
-              <w:start w:w="130" w:type="dxa"/>
-              <w:bottom w:w="120" w:type="dxa"/>
-              <w:end w:w="130" w:type="dxa"/>
-            </w:tcMar>
-            <w:shd w:fill="EAF2F8"/>
-          </w:tcPr>
-          <w:p>
-            <w:pPr>
-              <w:spacing w:after="0" w:line="252" w:lineRule="auto"/>
-            </w:pPr>
-            <w:r>
-              <w:rPr>
-                <w:rFonts w:ascii="Arial" w:hAnsi="Arial"/>
-                <w:b w:val="0"/>
-                <w:color w:val="000000"/>
-                <w:sz w:val="19"/>
-              </w:rPr>
-              <w:t>Confirms sports-specific validation.</w:t>
-            </w:r>
-          </w:p>
-        </w:tc>
-      </w:tr>
-      <w:tr>
-        <w:tc>
-          <w:tcPr>
-            <w:tcW w:type="dxa" w:w="3960"/>
-            <w:vAlign w:val="center"/>
-            <w:tcMar>
-              <w:top w:w="120" w:type="dxa"/>
-              <w:start w:w="130" w:type="dxa"/>
-              <w:bottom w:w="120" w:type="dxa"/>
-              <w:end w:w="130" w:type="dxa"/>
-            </w:tcMar>
-          </w:tcPr>
-          <w:p>
-            <w:pPr>
-              <w:spacing w:after="0" w:line="252" w:lineRule="auto"/>
-            </w:pPr>
-            <w:r>
-              <w:rPr>
-                <w:rFonts w:ascii="Arial" w:hAnsi="Arial"/>
-                <w:b w:val="0"/>
-                <w:color w:val="000000"/>
-                <w:sz w:val="19"/>
-              </w:rPr>
-              <w:t>Builder resets after build</w:t>
-            </w:r>
-          </w:p>
-        </w:tc>
-        <w:tc>
-          <w:tcPr>
-            <w:tcW w:type="dxa" w:w="5760"/>
-            <w:vAlign w:val="center"/>
-            <w:tcMar>
-              <w:top w:w="120" w:type="dxa"/>
-              <w:start w:w="130" w:type="dxa"/>
-              <w:bottom w:w="120" w:type="dxa"/>
-              <w:end w:w="130" w:type="dxa"/>
-            </w:tcMar>
-          </w:tcPr>
-          <w:p>
-            <w:pPr>
-              <w:spacing w:after="0" w:line="252" w:lineRule="auto"/>
-            </w:pPr>
-            <w:r>
-              <w:rPr>
-                <w:rFonts w:ascii="Arial" w:hAnsi="Arial"/>
-                <w:b w:val="0"/>
-                <w:color w:val="000000"/>
-                <w:sz w:val="19"/>
-              </w:rPr>
-              <w:t>Confirms temporary state does not leak into the next car.</w:t>
-            </w:r>
-          </w:p>
-        </w:tc>
-      </w:tr>
-    </w:tbl>
     <w:p>
       <w:pPr>
-        <w:spacing w:after="0"/>
+        <w:spacing w:line="276" w:lineRule="auto" w:after="120"/>
+        <w:ind w:firstLine="576"/>
+        <w:jc w:val="both"/>
       </w:pPr>
-    </w:p>
-    <w:p>
       <w:r>
-        <w:t>All seven tests pass on OpenJDK 17. The successful demonstration prints the complete state of each car, making the two representations and their features visible during the defense.</w:t>
+        <w:rPr>
+          <w:rFonts w:ascii="Times New Roman" w:hAnsi="Times New Roman"/>
+          <w:b w:val="0"/>
+          <w:i w:val="0"/>
+          <w:color w:val="000000"/>
+          <w:sz w:val="24"/>
+        </w:rPr>
+        <w:t>The disadvantage is that the pattern needs more classes than a normal constructor. It also takes some time to decide which code belongs in the main builder and which code belongs in the concrete builders. For a very simple object, Builder would be unnecessary, but it is suitable for this Car example because the object has many parts and different configurations.</w:t>
       </w:r>
     </w:p>
     <w:p>
       <w:pPr>
         <w:pStyle w:val="Heading1"/>
         <w:keepNext/>
+        <w:spacing w:before="240" w:after="100"/>
       </w:pPr>
       <w:r>
-        <w:t>6 Conclusion</w:t>
-      </w:r>
-    </w:p>
-    <w:p>
-      <w:r>
-        <w:t>While implementing this project, I found that Builder made complex construction easier to read because every argument gained a descriptive method name. Moving common behavior into AbstractCarBuilder also prevented duplicated setters and common checks. The concrete builders gave each representation a clear place for its own rules, and CarDirector made standard configurations repeatable.</w:t>
-      </w:r>
-    </w:p>
-    <w:p>
-      <w:r>
-        <w:t>The main disadvantage was the additional structure. A small Car class became an interface, an abstract builder, two concrete builders, and a Director. The builder lifecycle also required a deliberate reset after a successful build so old values would not leak into the next product. Another limitation is that the Director accepts the CarBuilder interface, so a client must pair the family recipe with PassengerCarBuilder and the sports recipe with SportsCarBuilder. The validation catches a wrong pairing, but stronger type separation could prevent it earlier at the cost of a less uniform Director API.</w:t>
-      </w:r>
-    </w:p>
-    <w:p>
-      <w:r>
-        <w:t>For this product, the benefits justify the extra classes because Car has multiple required parts, optional features, reusable configurations, and representation-specific constraints. For an object with only two or three simple values, a normal constructor would probably be clearer.</w:t>
+        <w:t>6 GitHub Repository</w:t>
       </w:r>
     </w:p>
     <w:p>
       <w:pPr>
-        <w:pStyle w:val="Heading1"/>
-        <w:keepNext/>
-      </w:pPr>
-      <w:r>
-        <w:t>7 GitHub Repository</w:t>
-      </w:r>
-    </w:p>
-    <w:p>
-      <w:r>
-        <w:t>The complete compiling source code, README instructions, UML source, test runner, report, and incremental commit history are available at:</w:t>
-      </w:r>
-    </w:p>
-    <w:p>
-      <w:pPr>
-        <w:spacing w:before="120" w:after="240"/>
-        <w:jc w:val="center"/>
+        <w:spacing w:line="276" w:lineRule="auto" w:after="120"/>
+        <w:jc w:val="both"/>
       </w:pPr>
       <w:r>
         <w:rPr>
-          <w:rFonts w:ascii="Arial" w:hAnsi="Arial"/>
-          <w:b/>
+          <w:rFonts w:ascii="Times New Roman" w:hAnsi="Times New Roman"/>
+          <w:b w:val="0"/>
+          <w:i w:val="0"/>
           <w:color w:val="000000"/>
-          <w:sz w:val="22"/>
+          <w:sz w:val="24"/>
         </w:rPr>
-        <w:t>https://github.com/Ziyadin23/car-builder-pattern</w:t>
-      </w:r>
-    </w:p>
-    <w:p>
-      <w:pPr>
-        <w:pStyle w:val="Heading1"/>
-        <w:keepNext/>
-      </w:pPr>
-      <w:r>
-        <w:t>References</w:t>
-      </w:r>
-    </w:p>
-    <w:p>
-      <w:pPr>
-        <w:pStyle w:val="ListBullet"/>
-      </w:pPr>
-      <w:r>
-        <w:t>Freeman, E., and Robson, E. Head First Design Patterns. Builder pattern chapter.</w:t>
-      </w:r>
-    </w:p>
-    <w:p>
-      <w:pPr>
-        <w:pStyle w:val="ListBullet"/>
-      </w:pPr>
-      <w:r>
-        <w:t>Martin, R. C. Clean Code A Handbook of Agile Software Craftsmanship. Prentice Hall, 2008.</w:t>
-      </w:r>
-    </w:p>
-    <w:p>
-      <w:pPr>
-        <w:pStyle w:val="ListBullet"/>
-      </w:pPr>
-      <w:r>
-        <w:t>Refactoring.Guru. Builder Design Pattern. https://refactoring.guru/design-patterns/builder</w:t>
+        <w:t>The source code and commit history are available at https://github.com/Ziyadin23/car-builder-pattern</w:t>
       </w:r>
     </w:p>
     <w:sectPr>
       <w:pgSz w:w="12240" w:h="15840"/>
-      <w:pgMar w:top="1080" w:right="1123" w:bottom="1008" w:left="1123" w:header="720" w:footer="720" w:gutter="0"/>
+      <w:pgMar w:top="1152" w:right="1152" w:bottom="1152" w:left="1440" w:header="720" w:footer="720" w:gutter="0"/>
       <w:cols w:space="720"/>
       <w:docGrid w:linePitch="360"/>
     </w:sectPr>
@@ -2952,13 +1060,10 @@
     <w:name w:val="Normal"/>
     <w:qFormat/>
     <w:rsid w:val="00FC693F"/>
-    <w:pPr>
-      <w:spacing w:after="120" w:line="259" w:lineRule="auto"/>
-    </w:pPr>
     <w:rPr>
-      <w:rFonts w:ascii="Arial" w:hAnsi="Arial"/>
+      <w:rFonts w:ascii="Times New Roman" w:hAnsi="Times New Roman"/>
       <w:color w:val="000000"/>
-      <w:sz w:val="22"/>
+      <w:sz w:val="24"/>
     </w:rPr>
   </w:style>
   <w:style w:type="paragraph" w:styleId="Header">
@@ -3016,15 +1121,15 @@
     <w:pPr>
       <w:keepNext/>
       <w:keepLines/>
-      <w:spacing w:before="240" w:after="100"/>
+      <w:spacing w:before="480" w:after="0"/>
       <w:outlineLvl w:val="0"/>
     </w:pPr>
     <w:rPr>
-      <w:rFonts w:asciiTheme="majorHAnsi" w:eastAsiaTheme="majorEastAsia" w:hAnsiTheme="majorHAnsi" w:cstheme="majorBidi" w:ascii="Arial" w:hAnsi="Arial"/>
+      <w:rFonts w:asciiTheme="majorHAnsi" w:eastAsiaTheme="majorEastAsia" w:hAnsiTheme="majorHAnsi" w:cstheme="majorBidi" w:ascii="Times New Roman" w:hAnsi="Times New Roman"/>
       <w:b/>
       <w:bCs/>
       <w:color w:val="000000"/>
-      <w:sz w:val="32"/>
+      <w:sz w:val="30"/>
       <w:szCs w:val="28"/>
     </w:rPr>
   </w:style>
@@ -3040,11 +1145,11 @@
     <w:pPr>
       <w:keepNext/>
       <w:keepLines/>
-      <w:spacing w:before="180" w:after="100"/>
+      <w:spacing w:before="200" w:after="0"/>
       <w:outlineLvl w:val="1"/>
     </w:pPr>
     <w:rPr>
-      <w:rFonts w:asciiTheme="majorHAnsi" w:eastAsiaTheme="majorEastAsia" w:hAnsiTheme="majorHAnsi" w:cstheme="majorBidi" w:ascii="Arial" w:hAnsi="Arial"/>
+      <w:rFonts w:asciiTheme="majorHAnsi" w:eastAsiaTheme="majorEastAsia" w:hAnsiTheme="majorHAnsi" w:cstheme="majorBidi" w:ascii="Times New Roman" w:hAnsi="Times New Roman"/>
       <w:b/>
       <w:bCs/>
       <w:color w:val="000000"/>
@@ -3064,15 +1169,14 @@
     <w:pPr>
       <w:keepNext/>
       <w:keepLines/>
-      <w:spacing w:before="180" w:after="100"/>
+      <w:spacing w:before="200" w:after="0"/>
       <w:outlineLvl w:val="2"/>
     </w:pPr>
     <w:rPr>
-      <w:rFonts w:asciiTheme="majorHAnsi" w:eastAsiaTheme="majorEastAsia" w:hAnsiTheme="majorHAnsi" w:cstheme="majorBidi" w:ascii="Arial" w:hAnsi="Arial"/>
+      <w:rFonts w:asciiTheme="majorHAnsi" w:eastAsiaTheme="majorEastAsia" w:hAnsiTheme="majorHAnsi" w:cstheme="majorBidi"/>
       <w:b/>
       <w:bCs/>
-      <w:color w:val="000000"/>
-      <w:sz w:val="23"/>
+      <w:color w:val="4F81BD" w:themeColor="accent1"/>
     </w:rPr>
   </w:style>
   <w:style w:type="paragraph" w:styleId="Heading4">
@@ -3307,12 +1411,12 @@
       <w:contextualSpacing/>
     </w:pPr>
     <w:rPr>
-      <w:rFonts w:asciiTheme="majorHAnsi" w:eastAsiaTheme="majorEastAsia" w:hAnsiTheme="majorHAnsi" w:cstheme="majorBidi" w:ascii="Arial" w:hAnsi="Arial"/>
+      <w:rFonts w:asciiTheme="majorHAnsi" w:eastAsiaTheme="majorEastAsia" w:hAnsiTheme="majorHAnsi" w:cstheme="majorBidi" w:ascii="Times New Roman" w:hAnsi="Times New Roman"/>
       <w:b/>
       <w:color w:val="000000"/>
       <w:spacing w:val="5"/>
       <w:kern w:val="28"/>
-      <w:sz w:val="50"/>
+      <w:sz w:val="40"/>
       <w:szCs w:val="52"/>
     </w:rPr>
   </w:style>

</xml_diff>

<commit_message>
docs: make report headings black
</commit_message>
<xml_diff>
--- a/docs/report/Builder_Pattern_Car_Report.docx
+++ b/docs/report/Builder_Pattern_Car_Report.docx
@@ -143,6 +143,9 @@
         <w:spacing w:before="240" w:after="100"/>
       </w:pPr>
       <w:r>
+        <w:rPr>
+          <w:color w:val="000000"/>
+        </w:rPr>
         <w:t>1 Introduction</w:t>
       </w:r>
     </w:p>
@@ -187,6 +190,9 @@
         <w:spacing w:before="240" w:after="100"/>
       </w:pPr>
       <w:r>
+        <w:rPr>
+          <w:color w:val="000000"/>
+        </w:rPr>
         <w:t>2 Implementation</w:t>
       </w:r>
     </w:p>
@@ -264,6 +270,9 @@
         <w:spacing w:before="240" w:after="100"/>
       </w:pPr>
       <w:r>
+        <w:rPr>
+          <w:color w:val="000000"/>
+        </w:rPr>
         <w:t>3 UML Class Diagram</w:t>
       </w:r>
     </w:p>
@@ -347,6 +356,9 @@
         <w:spacing w:before="240" w:after="100"/>
       </w:pPr>
       <w:r>
+        <w:rPr>
+          <w:color w:val="000000"/>
+        </w:rPr>
         <w:t>4 Clean Code Principles</w:t>
       </w:r>
     </w:p>
@@ -374,6 +386,9 @@
         <w:spacing w:before="160" w:after="100"/>
       </w:pPr>
       <w:r>
+        <w:rPr>
+          <w:color w:val="000000"/>
+        </w:rPr>
         <w:t>4 1 Meaningful Names</w:t>
       </w:r>
     </w:p>
@@ -420,6 +435,9 @@
         <w:spacing w:before="160" w:after="100"/>
       </w:pPr>
       <w:r>
+        <w:rPr>
+          <w:color w:val="000000"/>
+        </w:rPr>
         <w:t>4 2 Small Classes and Methods</w:t>
       </w:r>
     </w:p>
@@ -474,6 +492,9 @@
         <w:spacing w:before="160" w:after="100"/>
       </w:pPr>
       <w:r>
+        <w:rPr>
+          <w:color w:val="000000"/>
+        </w:rPr>
         <w:t>4 3 No Duplicated Builder Methods</w:t>
       </w:r>
     </w:p>
@@ -524,6 +545,9 @@
         <w:spacing w:before="160" w:after="100"/>
       </w:pPr>
       <w:r>
+        <w:rPr>
+          <w:color w:val="000000"/>
+        </w:rPr>
         <w:t>4 4 Validation</w:t>
       </w:r>
     </w:p>
@@ -578,6 +602,9 @@
         <w:spacing w:before="160" w:after="100"/>
       </w:pPr>
       <w:r>
+        <w:rPr>
+          <w:color w:val="000000"/>
+        </w:rPr>
         <w:t>4 5 No Magic Numbers</w:t>
       </w:r>
     </w:p>
@@ -624,6 +651,9 @@
         <w:spacing w:before="240" w:after="100"/>
       </w:pPr>
       <w:r>
+        <w:rPr>
+          <w:color w:val="000000"/>
+        </w:rPr>
         <w:t>5 Conclusion</w:t>
       </w:r>
     </w:p>
@@ -668,6 +698,9 @@
         <w:spacing w:before="240" w:after="100"/>
       </w:pPr>
       <w:r>
+        <w:rPr>
+          <w:color w:val="000000"/>
+        </w:rPr>
         <w:t>6 GitHub Repository</w:t>
       </w:r>
     </w:p>
@@ -1176,7 +1209,7 @@
       <w:rFonts w:asciiTheme="majorHAnsi" w:eastAsiaTheme="majorEastAsia" w:hAnsiTheme="majorHAnsi" w:cstheme="majorBidi"/>
       <w:b/>
       <w:bCs/>
-      <w:color w:val="4F81BD" w:themeColor="accent1"/>
+      <w:color w:val="000000"/>
     </w:rPr>
   </w:style>
   <w:style w:type="paragraph" w:styleId="Heading4">
@@ -1365,7 +1398,7 @@
       <w:rFonts w:asciiTheme="majorHAnsi" w:eastAsiaTheme="majorEastAsia" w:hAnsiTheme="majorHAnsi" w:cstheme="majorBidi"/>
       <w:b/>
       <w:bCs/>
-      <w:color w:val="365F91" w:themeColor="accent1" w:themeShade="BF"/>
+      <w:color w:val="000000"/>
       <w:sz w:val="28"/>
       <w:szCs w:val="28"/>
     </w:rPr>
@@ -1380,7 +1413,7 @@
       <w:rFonts w:asciiTheme="majorHAnsi" w:eastAsiaTheme="majorEastAsia" w:hAnsiTheme="majorHAnsi" w:cstheme="majorBidi"/>
       <w:b/>
       <w:bCs/>
-      <w:color w:val="4F81BD" w:themeColor="accent1"/>
+      <w:color w:val="000000"/>
       <w:sz w:val="26"/>
       <w:szCs w:val="26"/>
     </w:rPr>
@@ -1395,7 +1428,7 @@
       <w:rFonts w:asciiTheme="majorHAnsi" w:eastAsiaTheme="majorEastAsia" w:hAnsiTheme="majorHAnsi" w:cstheme="majorBidi"/>
       <w:b/>
       <w:bCs/>
-      <w:color w:val="4F81BD" w:themeColor="accent1"/>
+      <w:color w:val="000000"/>
     </w:rPr>
   </w:style>
   <w:style w:type="paragraph" w:styleId="Title">
@@ -1428,7 +1461,7 @@
     <w:rsid w:val="00FC693F"/>
     <w:rPr>
       <w:rFonts w:asciiTheme="majorHAnsi" w:eastAsiaTheme="majorEastAsia" w:hAnsiTheme="majorHAnsi" w:cstheme="majorBidi"/>
-      <w:color w:val="17365D" w:themeColor="text2" w:themeShade="BF"/>
+      <w:color w:val="000000"/>
       <w:spacing w:val="5"/>
       <w:kern w:val="28"/>
       <w:sz w:val="52"/>
@@ -1452,7 +1485,7 @@
       <w:rFonts w:asciiTheme="majorHAnsi" w:eastAsiaTheme="majorEastAsia" w:hAnsiTheme="majorHAnsi" w:cstheme="majorBidi"/>
       <w:i/>
       <w:iCs/>
-      <w:color w:val="4F81BD" w:themeColor="accent1"/>
+      <w:color w:val="000000"/>
       <w:spacing w:val="15"/>
       <w:sz w:val="24"/>
       <w:szCs w:val="24"/>
@@ -1468,7 +1501,7 @@
       <w:rFonts w:asciiTheme="majorHAnsi" w:eastAsiaTheme="majorEastAsia" w:hAnsiTheme="majorHAnsi" w:cstheme="majorBidi"/>
       <w:i/>
       <w:iCs/>
-      <w:color w:val="4F81BD" w:themeColor="accent1"/>
+      <w:color w:val="000000"/>
       <w:spacing w:val="15"/>
       <w:sz w:val="24"/>
       <w:szCs w:val="24"/>

</xml_diff>

<commit_message>
docs: improve UML image and shorten repo link
</commit_message>
<xml_diff>
--- a/docs/report/Builder_Pattern_Car_Report.docx
+++ b/docs/report/Builder_Pattern_Car_Report.docx
@@ -712,12 +712,9 @@
       <w:r>
         <w:rPr>
           <w:rFonts w:ascii="Times New Roman" w:hAnsi="Times New Roman"/>
-          <w:b w:val="0"/>
-          <w:i w:val="0"/>
-          <w:color w:val="000000"/>
           <w:sz w:val="24"/>
         </w:rPr>
-        <w:t>The source code and commit history are available at https://github.com/Ziyadin23/car-builder-pattern</w:t>
+        <w:t>https://github.com/Ziyadin23/car-builder-pattern</w:t>
       </w:r>
     </w:p>
     <w:sectPr>

</xml_diff>